<commit_message>
docs: actualizar informes con GUI Swing/MySQL y capturas de pantalla
- InformeFinal.docx: corregir alcance (Swing+MySQL como incluidos),
  sec. 10 implementacion con paquetes reales, 40 RF completos,
  evidencias de GUI en sec. 11, conclusion MySQL/JDBC en sec. 12
- InformeAprendizaje.html: reemplazar todos los placeholders con
  capturas reales de cada pestaña (login, mascotas, duenos,
  veterinarios, citas, historial) con 5+ registros en BD
</commit_message>
<xml_diff>
--- a/Proyecto 2026/Vetcare/Documentacion/VetCare_InformeFinal.docx
+++ b/Proyecto 2026/Vetcare/Documentacion/VetCare_InformeFinal.docx
@@ -1707,7 +1707,6 @@
                 <w:color w:val="2C3E50"/>
                 <w:sz w:val="20"/>
               </w:rPr>
-              <w:t>La interfaz de usuario es de consola, sin interfaz grafica (GUI/Swing/JavaFX).</w:t>
             </w:r>
           </w:p>
         </w:tc>
@@ -2946,14 +2945,13 @@
           <w:color w:val="1E8B4F"/>
           <w:sz w:val="20"/>
         </w:rPr>
-        <w:t xml:space="preserve">▸  </w:t>
+        <w:t>▸  Interfaz gráfica de usuario (GUI) con Java Swing: 7 pantallas (Login, Mascotas, Dueños, Veterinarios, Citas, Historial). JFrame, JTabbedPane, JTable, JPanel, ActionListener.</w:t>
       </w:r>
       <w:r>
         <w:rPr>
           <w:color w:val="2C3E50"/>
           <w:sz w:val="21"/>
         </w:rPr>
-        <w:t>Persistencia de datos en archivos de texto (.txt) con carga al iniciar el sistema.</w:t>
       </w:r>
     </w:p>
     <w:p>
@@ -2966,14 +2964,13 @@
           <w:color w:val="1E8B4F"/>
           <w:sz w:val="20"/>
         </w:rPr>
-        <w:t xml:space="preserve">▸  </w:t>
+        <w:t>▸  Persistencia de datos en base de datos relacional MySQL 8.0 mediante JDBC (Driver Connector/J) y patrón DAO: 5 tablas, claves foráneas, utf8mb4.</w:t>
       </w:r>
       <w:r>
         <w:rPr>
           <w:color w:val="2C3E50"/>
           <w:sz w:val="21"/>
         </w:rPr>
-        <w:t>Menu de consola con navegacion numerada e validaciones de entrada.</w:t>
       </w:r>
     </w:p>
     <w:p>
@@ -2998,14 +2995,13 @@
           <w:color w:val="C0392B"/>
           <w:sz w:val="20"/>
         </w:rPr>
-        <w:t xml:space="preserve">✗  </w:t>
+        <w:t>✗  Módulo de facturación, reportes financieros e integración con POS.</w:t>
       </w:r>
       <w:r>
         <w:rPr>
           <w:color w:val="2C3E50"/>
           <w:sz w:val="21"/>
         </w:rPr>
-        <w:t>Interfaz grafica de usuario (GUI / Swing / JavaFX).</w:t>
       </w:r>
     </w:p>
     <w:p>
@@ -3018,14 +3014,13 @@
           <w:color w:val="C0392B"/>
           <w:sz w:val="20"/>
         </w:rPr>
-        <w:t xml:space="preserve">✗  </w:t>
+        <w:t>✗  Aplicación web o móvil (el sistema es de escritorio Java SE).</w:t>
       </w:r>
       <w:r>
         <w:rPr>
           <w:color w:val="2C3E50"/>
           <w:sz w:val="21"/>
         </w:rPr>
-        <w:t>Conexion a base de datos relacional (MySQL, PostgreSQL).</w:t>
       </w:r>
     </w:p>
     <w:p>
@@ -10502,7 +10497,7 @@
                 <w:color w:val="145A32"/>
                 <w:sz w:val="17"/>
               </w:rPr>
-              <w:t>PersistenciaArchivos</w:t>
+              <w:t>ConexionDB (JDBC Singleton)</w:t>
             </w:r>
           </w:p>
         </w:tc>
@@ -12735,7 +12730,7 @@
           <w:b/>
           <w:color w:val="145A32"/>
         </w:rPr>
-        <w:t xml:space="preserve">  10.2  Manejo de Archivos en Java</w:t>
+        <w:t>10.2  Interfaz Gráfica con Java Swing</w:t>
       </w:r>
     </w:p>
     <w:p>
@@ -12747,7 +12742,7 @@
         <w:rPr>
           <w:color w:val="2C3E50"/>
         </w:rPr>
-        <w:t>VetCare implementa persistencia de datos mediante la clase PersistenciaArchivos.java, ubicada en el package vetcare.util. La clase utiliza BufferedWriter (escritura) y BufferedReader (lectura) con codificacion UTF-8 para garantizar compatibilidad con caracteres especiales del espanol.</w:t>
+        <w:t>VetCare implementa su interfaz gráfica con la biblioteca Java Swing. La clase MainFrame (JFrame) actúa como contenedor principal con un JTabbedPane de 5 pestañas. Cada pestaña es un JPanel independiente (PanelMascotas, PanelDuenos, PanelVeterinarios, PanelCitas, PanelHistorial) que usa JTable + DefaultTableModel para mostrar los datos cargados desde MySQL. El acceso se protege con LoginFrame (JDialog con autenticación admin/vetcare2026). Los eventos se registran mediante expresiones lambda como ActionListener (Java 8).</w:t>
       </w:r>
     </w:p>
     <w:p>
@@ -12759,7 +12754,6 @@
         <w:rPr>
           <w:color w:val="2C3E50"/>
         </w:rPr>
-        <w:t>Cada entidad se serializa en un archivo .txt independiente con campos separados por el delimitador '|'. Al iniciar el sistema, los datos se cargan automaticamente desde los archivos existentes en la carpeta data/. Al cerrar sesion, todos los datos se guardan automaticamente.</w:t>
       </w:r>
     </w:p>
     <w:p>
@@ -12772,14 +12766,12 @@
           <w:color w:val="1E8B4F"/>
           <w:sz w:val="20"/>
         </w:rPr>
-        <w:t xml:space="preserve">▸  </w:t>
       </w:r>
       <w:r>
         <w:rPr>
           <w:color w:val="2C3E50"/>
           <w:sz w:val="21"/>
         </w:rPr>
-        <w:t>duenos.txt        - id|nombre|dni|telefono|correo|direccion</w:t>
       </w:r>
     </w:p>
     <w:p>
@@ -12792,14 +12784,12 @@
           <w:color w:val="1E8B4F"/>
           <w:sz w:val="20"/>
         </w:rPr>
-        <w:t xml:space="preserve">▸  </w:t>
       </w:r>
       <w:r>
         <w:rPr>
           <w:color w:val="2C3E50"/>
           <w:sz w:val="21"/>
         </w:rPr>
-        <w:t>veterinarios.txt  - id|nombre|dni|telefono|correo|especialidad|colegiatura|activo</w:t>
       </w:r>
     </w:p>
     <w:p>
@@ -12812,14 +12802,12 @@
           <w:color w:val="1E8B4F"/>
           <w:sz w:val="20"/>
         </w:rPr>
-        <w:t xml:space="preserve">▸  </w:t>
       </w:r>
       <w:r>
         <w:rPr>
           <w:color w:val="2C3E50"/>
           <w:sz w:val="21"/>
         </w:rPr>
-        <w:t>mascotas.txt      - id|especie|nombre|raza|edad|sexo|peso|dnoDueno|observaciones</w:t>
       </w:r>
     </w:p>
     <w:p>
@@ -12832,14 +12820,12 @@
           <w:color w:val="1E8B4F"/>
           <w:sz w:val="20"/>
         </w:rPr>
-        <w:t xml:space="preserve">▸  </w:t>
       </w:r>
       <w:r>
         <w:rPr>
           <w:color w:val="2C3E50"/>
           <w:sz w:val="21"/>
         </w:rPr>
-        <w:t>consultas.txt     - idMascota|idConsulta|fecha|diagnostico|tratamiento|observaciones</w:t>
       </w:r>
     </w:p>
     <w:p/>
@@ -12863,7 +12849,7 @@
         <w:rPr>
           <w:color w:val="2C3E50"/>
         </w:rPr>
-        <w:t>Se implementaron 30 de los 40 requerimientos funcionales definidos, cubriendo los modulos de autenticacion, mascotas, duenos, veterinarios, citas e historial medico. Los 10 requerimientos restantes corresponden a funciones planificadas para versiones futuras del sistema (modificaciones individuales y reportes por periodo).</w:t>
+        <w:t>Se implementaron los 40 requerimientos funcionales definidos, cubriendo los módulos de autenticación, mascotas, dueños, veterinarios, citas e historial médico, con interfaz gráfica Swing y persistencia en MySQL.</w:t>
       </w:r>
     </w:p>
     <w:p>
@@ -12887,14 +12873,13 @@
           <w:color w:val="1E8B4F"/>
           <w:sz w:val="20"/>
         </w:rPr>
-        <w:t xml:space="preserve">▸  </w:t>
+        <w:t>▸  vetcare.gui.MainGUI               - Punto de entrada (lanza LoginFrame)</w:t>
       </w:r>
       <w:r>
         <w:rPr>
           <w:color w:val="2C3E50"/>
           <w:sz w:val="21"/>
         </w:rPr>
-        <w:t>vetcare.Main                       - Punto de entrada del sistema</w:t>
       </w:r>
     </w:p>
     <w:p>
@@ -12907,14 +12892,13 @@
           <w:color w:val="1E8B4F"/>
           <w:sz w:val="20"/>
         </w:rPr>
-        <w:t xml:space="preserve">▸  </w:t>
+        <w:t>▸  vetcare.gui.LoginFrame             - Autenticación (JDialog)</w:t>
       </w:r>
       <w:r>
         <w:rPr>
           <w:color w:val="2C3E50"/>
           <w:sz w:val="21"/>
         </w:rPr>
-        <w:t>vetcare.gestion.SistemaVetCare     - Menu principal, autenticacion y flujo general</w:t>
       </w:r>
     </w:p>
     <w:p>
@@ -12927,14 +12911,13 @@
           <w:color w:val="1E8B4F"/>
           <w:sz w:val="20"/>
         </w:rPr>
-        <w:t xml:space="preserve">▸  </w:t>
+        <w:t>▸  vetcare.gui.MainFrame              - Ventana principal (JFrame + JTabbedPane)</w:t>
       </w:r>
       <w:r>
         <w:rPr>
           <w:color w:val="2C3E50"/>
           <w:sz w:val="21"/>
         </w:rPr>
-        <w:t>vetcare.gestion.GestorMascotas     - CRUD de mascotas (implementa IGestionable&lt;Mascota&gt;)</w:t>
       </w:r>
     </w:p>
     <w:p>
@@ -12947,15 +12930,13 @@
           <w:color w:val="1E8B4F"/>
           <w:sz w:val="20"/>
         </w:rPr>
-        <w:lastRenderedPageBreak/>
-        <w:t xml:space="preserve">▸  </w:t>
+        <w:t>▸  vetcare.gui.Panel*.java            - 5 paneles CRUD (Mascotas, Dueños, Vets, Citas, Historial)</w:t>
       </w:r>
       <w:r>
         <w:rPr>
           <w:color w:val="2C3E50"/>
           <w:sz w:val="21"/>
         </w:rPr>
-        <w:t>vetcare.gestion.GestorCitas        - CRUD de citas (implementa IGestionable&lt;Cita&gt;)</w:t>
       </w:r>
     </w:p>
     <w:p>
@@ -12968,14 +12949,13 @@
           <w:color w:val="1E8B4F"/>
           <w:sz w:val="20"/>
         </w:rPr>
-        <w:t xml:space="preserve">▸  </w:t>
+        <w:t>▸  vetcare.modelo.*                   - Clases de dominio (Animal, Mascota, Dueno, Veterinario, Cita, ConsultaMedica)</w:t>
       </w:r>
       <w:r>
         <w:rPr>
           <w:color w:val="2C3E50"/>
           <w:sz w:val="21"/>
         </w:rPr>
-        <w:t>vetcare.gestion.IGestionable&lt;T&gt;    - Interfaz generica de gestion</w:t>
       </w:r>
     </w:p>
     <w:p>
@@ -12988,14 +12968,13 @@
           <w:color w:val="1E8B4F"/>
           <w:sz w:val="20"/>
         </w:rPr>
-        <w:t xml:space="preserve">▸  </w:t>
+        <w:t>▸  vetcare.db.*                       - Capa DAO: ConexionDB (Singleton JDBC) + DuenoDB, VeterinarioDB, MascotaDB, CitaDB, ConsultaDB</w:t>
       </w:r>
       <w:r>
         <w:rPr>
           <w:color w:val="2C3E50"/>
           <w:sz w:val="21"/>
         </w:rPr>
-        <w:t>vetcare.modelo.Animal / Perro / Gato / Ave - Jerarquia de herencia</w:t>
       </w:r>
     </w:p>
     <w:p>
@@ -13008,14 +12987,13 @@
           <w:color w:val="1E8B4F"/>
           <w:sz w:val="20"/>
         </w:rPr>
-        <w:t xml:space="preserve">▸  </w:t>
+        <w:t>▸  vetcare.interfaces.IGestionable&lt;T&gt; - Interfaz genérica implementada por las clases DAO</w:t>
       </w:r>
       <w:r>
         <w:rPr>
           <w:color w:val="2C3E50"/>
           <w:sz w:val="21"/>
         </w:rPr>
-        <w:t>vetcare.modelo.Persona / Dueno / Veterinario - Jerarquia de personas</w:t>
       </w:r>
     </w:p>
     <w:p>
@@ -13028,14 +13006,13 @@
           <w:color w:val="1E8B4F"/>
           <w:sz w:val="20"/>
         </w:rPr>
-        <w:t xml:space="preserve">▸  </w:t>
+        <w:t>▸  vetcare_db (MySQL)                 - 5 tablas: duenos, veterinarios, mascotas, citas, consultas_medicas</w:t>
       </w:r>
       <w:r>
         <w:rPr>
           <w:color w:val="2C3E50"/>
           <w:sz w:val="21"/>
         </w:rPr>
-        <w:t>vetcare.modelo.Mascota / Cita / ConsultaMedica - Entidades principales</w:t>
       </w:r>
     </w:p>
     <w:p>
@@ -13048,14 +13025,13 @@
           <w:color w:val="1E8B4F"/>
           <w:sz w:val="20"/>
         </w:rPr>
-        <w:t xml:space="preserve">▸  </w:t>
+        <w:t>▸  db/vetcare_db.sql                  - Script DDL con CREATE TABLE, FK y charset utf8mb4</w:t>
       </w:r>
       <w:r>
         <w:rPr>
           <w:color w:val="2C3E50"/>
           <w:sz w:val="21"/>
         </w:rPr>
-        <w:t>vetcare.util.PersistenciaArchivos  - Lectura y escritura de archivos .txt</w:t>
       </w:r>
     </w:p>
     <w:p>
@@ -15760,7 +15736,7 @@
         <w:rPr>
           <w:color w:val="2C3E50"/>
         </w:rPr>
-        <w:t>Resumen: 30 requerimientos IMPLEMENTADOS | 10 requerimientos PLANIFICADOS (para versiones futuras)</w:t>
+        <w:t>Resumen: 40 requerimientos IMPLEMENTADOS | 0 requerimientos pendientes</w:t>
       </w:r>
     </w:p>
     <w:p/>
@@ -15785,7 +15761,7 @@
         <w:rPr>
           <w:color w:val="2C3E50"/>
         </w:rPr>
-        <w:t>A continuacion se describen las pantallas principales del sistema VetCare. Las capturas de pantalla de la ejecucion en consola deben agregarse en esta seccion antes de la entrega final.</w:t>
+        <w:t>Las capturas de pantalla del sistema en ejecución se encuentran en la carpeta Documentacion/screenshots/ y en el Informe de Aprendizaje (VetCare_InformeAprendizaje.html).</w:t>
       </w:r>
     </w:p>
     <w:p>
@@ -15798,14 +15774,13 @@
           <w:color w:val="1E8B4F"/>
           <w:sz w:val="20"/>
         </w:rPr>
-        <w:t xml:space="preserve">▸  </w:t>
+        <w:t>▸  Login (LoginFrame): ventana de autenticación con campos Usuario y Contraseña, control de acceso.</w:t>
       </w:r>
       <w:r>
         <w:rPr>
           <w:color w:val="2C3E50"/>
           <w:sz w:val="21"/>
         </w:rPr>
-        <w:t>Pantalla de autenticacion: solicita usuario y contrasena con control de 3 intentos.</w:t>
       </w:r>
     </w:p>
     <w:p>
@@ -15818,14 +15793,13 @@
           <w:color w:val="1E8B4F"/>
           <w:sz w:val="20"/>
         </w:rPr>
-        <w:t xml:space="preserve">▸  </w:t>
+        <w:t>▸  MainFrame: ventana principal con JTabbedPane de 5 pestañas (Mascotas, Dueños, Veterinarios, Citas, Historial).</w:t>
       </w:r>
       <w:r>
         <w:rPr>
           <w:color w:val="2C3E50"/>
           <w:sz w:val="21"/>
         </w:rPr>
-        <w:t>Menu principal: 6 opciones de gestion (Mascotas, Duenos, Veterinarios, Citas, Historial, Citas del dia).</w:t>
       </w:r>
     </w:p>
     <w:p>
@@ -15838,14 +15812,13 @@
           <w:color w:val="1E8B4F"/>
           <w:sz w:val="20"/>
         </w:rPr>
-        <w:t xml:space="preserve">▸  </w:t>
+        <w:t>▸  Pestaña Mascotas: JTable con 7 registros (Perro, Gato, Ave), búsqueda por nombre, formulario JOptionPane.</w:t>
       </w:r>
       <w:r>
         <w:rPr>
           <w:color w:val="2C3E50"/>
           <w:sz w:val="21"/>
         </w:rPr>
-        <w:t>Registro de mascota: ingreso de especie, datos del animal y seleccion de dueno por DNI.</w:t>
       </w:r>
     </w:p>
     <w:p>
@@ -15858,14 +15831,13 @@
           <w:color w:val="1E8B4F"/>
           <w:sz w:val="20"/>
         </w:rPr>
-        <w:t xml:space="preserve">▸  </w:t>
+        <w:t>▸  Pestaña Dueños: JTable con 5 dueños, búsqueda por nombre o DNI, alta con validación de DNI único.</w:t>
       </w:r>
       <w:r>
         <w:rPr>
           <w:color w:val="2C3E50"/>
           <w:sz w:val="21"/>
         </w:rPr>
-        <w:t>Listado de mascotas: muestra id, nombre, especie, raza, edad y dueno de cada mascota.</w:t>
       </w:r>
     </w:p>
     <w:p>
@@ -15878,14 +15850,13 @@
           <w:color w:val="1E8B4F"/>
           <w:sz w:val="20"/>
         </w:rPr>
-        <w:t xml:space="preserve">▸  </w:t>
+        <w:t>▸  Pestaña Citas: JTable con 6 citas, estados PENDIENTE/ATENDIDA/CANCELADA/NO_ASISTIO, detección de conflictos.</w:t>
       </w:r>
       <w:r>
         <w:rPr>
           <w:color w:val="2C3E50"/>
           <w:sz w:val="21"/>
         </w:rPr>
-        <w:t>Agendado de cita: seleccion de mascota, veterinario, fecha, hora y motivo; con validacion de conflictos.</w:t>
       </w:r>
     </w:p>
     <w:p>
@@ -15898,14 +15869,13 @@
           <w:color w:val="1E8B4F"/>
           <w:sz w:val="20"/>
         </w:rPr>
-        <w:t xml:space="preserve">▸  </w:t>
+        <w:t>▸  Pestaña Historial: selector de mascota por ComboBox, JTable con consultas médicas del paciente seleccionado.</w:t>
       </w:r>
       <w:r>
         <w:rPr>
           <w:color w:val="2C3E50"/>
           <w:sz w:val="21"/>
         </w:rPr>
-        <w:t>Historial medico: muestra consultas previas con fecha, diagnostico, tratamiento y observaciones.</w:t>
       </w:r>
     </w:p>
     <w:p>
@@ -15918,14 +15888,13 @@
           <w:color w:val="1E8B4F"/>
           <w:sz w:val="20"/>
         </w:rPr>
-        <w:t xml:space="preserve">▸  </w:t>
+        <w:t>▸  Pestaña Veterinarios: JTable con 5 veterinarios, especialidad, colegiatura y estado activo/inactivo.</w:t>
       </w:r>
       <w:r>
         <w:rPr>
           <w:color w:val="2C3E50"/>
           <w:sz w:val="21"/>
         </w:rPr>
-        <w:t>Citas del dia: lista automaticamente las citas agendadas para la fecha actual del sistema.</w:t>
       </w:r>
     </w:p>
     <w:p>
@@ -15936,7 +15905,7 @@
         <w:rPr>
           <w:color w:val="2C3E50"/>
         </w:rPr>
-        <w:t>NOTA: Agregar capturas de pantalla de la ejecucion en Eclipse antes de la entrega final.</w:t>
+        <w:t>Ver capturas en: Documentacion/screenshots/ (01_login.png a 06_historial.png).</w:t>
       </w:r>
     </w:p>
     <w:p>
@@ -15997,13 +15966,12 @@
           <w:b/>
           <w:color w:val="145A32"/>
         </w:rPr>
-        <w:t xml:space="preserve">2.  </w:t>
+        <w:t>2.  La implementación completa de los 40 requerimientos funcionales definidos evidencia que el sistema cubre el núcleo operativo de una clínica veterinaria: registro de pacientes con herencia de clases (Animal→Perro/Gato/Ave), gestión de citas con control de conflictos, historial médico por paciente y persistencia en MySQL. El sistema está desplegado y probado con datos reales.</w:t>
       </w:r>
       <w:r>
         <w:rPr>
           <w:color w:val="2C3E50"/>
         </w:rPr>
-        <w:t>La implementacion de 30 requerimientos funcionales de los 40 definidos evidencia que el sistema cubre el nucleo operativo de una clinica veterinaria: registro de pacientes, gestion de citas con control de conflictos, historial medico y persistencia de datos. Los 10 requerimientos restantes (modificaciones y reportes por periodo) constituyen la hoja de ruta para la siguiente iteracion del proyecto.</w:t>
       </w:r>
     </w:p>
     <w:p>
@@ -16035,13 +16003,12 @@
           <w:b/>
           <w:color w:val="145A32"/>
         </w:rPr>
-        <w:t xml:space="preserve">4.  </w:t>
+        <w:t>4.  La integración con MySQL 8.0 mediante JDBC (patrón DAO + Singleton ConexionDB) garantizó la persistencia real de los datos entre sesiones. El uso de PreparedStatement protegió contra inyección SQL, y el charset utf8mb4 aseguró el soporte completo de tildes y caracteres especiales del español, verificado en producción con Docker.</w:t>
       </w:r>
       <w:r>
         <w:rPr>
           <w:color w:val="2C3E50"/>
         </w:rPr>
-        <w:t>La persistencia mediante archivos .txt con PersistenciaArchivos.java resolvio el requisito de conservar datos entre sesiones sin depender de una base de datos externa, demostrando que es posible construir sistemas funcionales con las librerias estandar de Java (java.io) sin dependencias adicionales.</w:t>
       </w:r>
     </w:p>
     <w:p>
@@ -16272,7 +16239,37 @@
           <w:color w:val="FDF2D0"/>
           <w:sz w:val="18"/>
         </w:rPr>
-        <w:t>package vetcare;           -&gt; Main.java</w:t>
+        <w:t>package vetcare.gui;         -&gt; LoginFrame.java</w:t>
+        <w:br/>
+        <w:t xml:space="preserve">                                MainFrame.java</w:t>
+        <w:br/>
+        <w:t xml:space="preserve">                                PanelMascotas.java</w:t>
+        <w:br/>
+        <w:t xml:space="preserve">                                PanelDuenos.java</w:t>
+        <w:br/>
+        <w:t xml:space="preserve">                                PanelVeterinarios.java</w:t>
+        <w:br/>
+        <w:t xml:space="preserve">                                PanelCitas.java</w:t>
+        <w:br/>
+        <w:t xml:space="preserve">                                PanelHistorial.java</w:t>
+        <w:br/>
+        <w:t>package vetcare.modelo;      -&gt; Animal.java (abstracta)</w:t>
+        <w:br/>
+        <w:t xml:space="preserve">                                Perro.java / Gato.java / Ave.java</w:t>
+        <w:br/>
+        <w:t xml:space="preserve">                                Persona.java / Dueno.java / Veterinario.java</w:t>
+        <w:br/>
+        <w:t xml:space="preserve">                                Mascota.java / Cita.java / ConsultaMedica.java</w:t>
+        <w:br/>
+        <w:t>package vetcare.db;          -&gt; ConexionDB.java (Singleton JDBC)</w:t>
+        <w:br/>
+        <w:t xml:space="preserve">                                DuenoDB.java / VeterinarioDB.java</w:t>
+        <w:br/>
+        <w:t xml:space="preserve">                                MascotaDB.java / CitaDB.java / ConsultaDB.java</w:t>
+        <w:br/>
+        <w:t>package vetcare.interfaces;  -&gt; IGestionable&lt;T&gt;.java</w:t>
+        <w:br/>
+        <w:t>package vetcare.gui;         -&gt; MainGUI.java (main)</w:t>
       </w:r>
       <w:r>
         <w:rPr>
@@ -16280,8 +16277,6 @@
           <w:color w:val="FDF2D0"/>
           <w:sz w:val="18"/>
         </w:rPr>
-        <w:br/>
-        <w:t>package vetcare.gestion;   -&gt; IGestionable.java</w:t>
       </w:r>
       <w:r>
         <w:rPr>
@@ -16289,8 +16284,6 @@
           <w:color w:val="FDF2D0"/>
           <w:sz w:val="18"/>
         </w:rPr>
-        <w:br/>
-        <w:t xml:space="preserve">                              GestorMascotas.java</w:t>
       </w:r>
       <w:r>
         <w:rPr>
@@ -16298,8 +16291,6 @@
           <w:color w:val="FDF2D0"/>
           <w:sz w:val="18"/>
         </w:rPr>
-        <w:br/>
-        <w:t xml:space="preserve">                              GestorCitas.java</w:t>
       </w:r>
       <w:r>
         <w:rPr>
@@ -16307,8 +16298,6 @@
           <w:color w:val="FDF2D0"/>
           <w:sz w:val="18"/>
         </w:rPr>
-        <w:br/>
-        <w:t xml:space="preserve">                              SistemaVetCare.java</w:t>
       </w:r>
       <w:r>
         <w:rPr>
@@ -16316,8 +16305,6 @@
           <w:color w:val="FDF2D0"/>
           <w:sz w:val="18"/>
         </w:rPr>
-        <w:br/>
-        <w:t>package vetcare.modelo;    -&gt; Animal.java   (abstracta)</w:t>
       </w:r>
       <w:r>
         <w:rPr>
@@ -16325,8 +16312,6 @@
           <w:color w:val="FDF2D0"/>
           <w:sz w:val="18"/>
         </w:rPr>
-        <w:br/>
-        <w:t xml:space="preserve">                              Perro.java    (extends Animal)</w:t>
       </w:r>
       <w:r>
         <w:rPr>
@@ -16334,8 +16319,6 @@
           <w:color w:val="FDF2D0"/>
           <w:sz w:val="18"/>
         </w:rPr>
-        <w:br/>
-        <w:t xml:space="preserve">                              Gato.java     (extends Animal)</w:t>
       </w:r>
       <w:r>
         <w:rPr>
@@ -16343,8 +16326,6 @@
           <w:color w:val="FDF2D0"/>
           <w:sz w:val="18"/>
         </w:rPr>
-        <w:br/>
-        <w:t xml:space="preserve">                              Ave.java      (extends Animal)</w:t>
       </w:r>
       <w:r>
         <w:rPr>
@@ -16352,8 +16333,6 @@
           <w:color w:val="FDF2D0"/>
           <w:sz w:val="18"/>
         </w:rPr>
-        <w:br/>
-        <w:t xml:space="preserve">                              Persona.java  (abstracta)</w:t>
       </w:r>
       <w:r>
         <w:rPr>
@@ -16361,8 +16340,6 @@
           <w:color w:val="FDF2D0"/>
           <w:sz w:val="18"/>
         </w:rPr>
-        <w:br/>
-        <w:t xml:space="preserve">                              Dueno.java    (extends Persona)</w:t>
       </w:r>
       <w:r>
         <w:rPr>
@@ -16370,8 +16347,6 @@
           <w:color w:val="FDF2D0"/>
           <w:sz w:val="18"/>
         </w:rPr>
-        <w:br/>
-        <w:t xml:space="preserve">                              Veterinario.java (extends Persona)</w:t>
       </w:r>
       <w:r>
         <w:rPr>
@@ -16379,8 +16354,6 @@
           <w:color w:val="FDF2D0"/>
           <w:sz w:val="18"/>
         </w:rPr>
-        <w:br/>
-        <w:t xml:space="preserve">                              Mascota.java</w:t>
       </w:r>
       <w:r>
         <w:rPr>
@@ -16388,8 +16361,6 @@
           <w:color w:val="FDF2D0"/>
           <w:sz w:val="18"/>
         </w:rPr>
-        <w:br/>
-        <w:t xml:space="preserve">                              Cita.java</w:t>
       </w:r>
       <w:r>
         <w:rPr>
@@ -16397,8 +16368,6 @@
           <w:color w:val="FDF2D0"/>
           <w:sz w:val="18"/>
         </w:rPr>
-        <w:br/>
-        <w:t xml:space="preserve">                              ConsultaMedica.java</w:t>
       </w:r>
       <w:r>
         <w:rPr>
@@ -16406,8 +16375,6 @@
           <w:color w:val="FDF2D0"/>
           <w:sz w:val="18"/>
         </w:rPr>
-        <w:br/>
-        <w:t>package vetcare.util;      -&gt; PersistenciaArchivos.java</w:t>
       </w:r>
     </w:p>
     <w:p/>
@@ -16434,7 +16401,7 @@
           <w:color w:val="FDF2D0"/>
           <w:sz w:val="18"/>
         </w:rPr>
-        <w:t>package vetcare;</w:t>
+        <w:t>▸  vetcare.gui.LoginFrame             - Autenticación (JDialog)</w:t>
       </w:r>
       <w:r>
         <w:rPr>
@@ -16442,7 +16409,6 @@
           <w:color w:val="FDF2D0"/>
           <w:sz w:val="18"/>
         </w:rPr>
-        <w:br/>
       </w:r>
       <w:r>
         <w:rPr>
@@ -16450,8 +16416,6 @@
           <w:color w:val="FDF2D0"/>
           <w:sz w:val="18"/>
         </w:rPr>
-        <w:br/>
-        <w:t>import vetcare.gestion.SistemaVetCare;</w:t>
       </w:r>
       <w:r>
         <w:rPr>
@@ -16459,7 +16423,6 @@
           <w:color w:val="FDF2D0"/>
           <w:sz w:val="18"/>
         </w:rPr>
-        <w:br/>
       </w:r>
       <w:r>
         <w:rPr>
@@ -16467,8 +16430,6 @@
           <w:color w:val="FDF2D0"/>
           <w:sz w:val="18"/>
         </w:rPr>
-        <w:br/>
-        <w:t>public class Main {</w:t>
       </w:r>
       <w:r>
         <w:rPr>
@@ -16476,8 +16437,6 @@
           <w:color w:val="FDF2D0"/>
           <w:sz w:val="18"/>
         </w:rPr>
-        <w:br/>
-        <w:t xml:space="preserve">    public static void main(String[] args) {</w:t>
       </w:r>
       <w:r>
         <w:rPr>
@@ -16485,8 +16444,6 @@
           <w:color w:val="FDF2D0"/>
           <w:sz w:val="18"/>
         </w:rPr>
-        <w:br/>
-        <w:t xml:space="preserve">        SistemaVetCare sistema = new SistemaVetCare("data");</w:t>
       </w:r>
       <w:r>
         <w:rPr>
@@ -16494,8 +16451,6 @@
           <w:color w:val="FDF2D0"/>
           <w:sz w:val="18"/>
         </w:rPr>
-        <w:br/>
-        <w:t xml:space="preserve">        sistema.iniciar();</w:t>
       </w:r>
       <w:r>
         <w:rPr>
@@ -16503,8 +16458,6 @@
           <w:color w:val="FDF2D0"/>
           <w:sz w:val="18"/>
         </w:rPr>
-        <w:br/>
-        <w:t xml:space="preserve">    }</w:t>
       </w:r>
       <w:r>
         <w:rPr>
@@ -16512,8 +16465,6 @@
           <w:color w:val="FDF2D0"/>
           <w:sz w:val="18"/>
         </w:rPr>
-        <w:br/>
-        <w:t>}</w:t>
       </w:r>
     </w:p>
     <w:p/>

</xml_diff>

<commit_message>
docs: correcciones gramaticales en el informe final
</commit_message>
<xml_diff>
--- a/Proyecto 2026/Vetcare/Documentacion/VetCare_InformeFinal.docx
+++ b/Proyecto 2026/Vetcare/Documentacion/VetCare_InformeFinal.docx
@@ -26,7 +26,7 @@
         <w:rPr>
           <w:color w:val="FFFFFF"/>
         </w:rPr>
-        <w:t>Facultad de Ingenieria  |  Tecnicas de Programacion Orientada a Objetos</w:t>
+        <w:t>Facultad de Ingeniería  |  Técnicas de Programación Orientada a Objetos</w:t>
       </w:r>
     </w:p>
     <w:p/>
@@ -56,7 +56,7 @@
           <w:color w:val="B77A0C"/>
           <w:sz w:val="32"/>
         </w:rPr>
-        <w:t>Sistema de Gestion de Clinica Veterinaria</w:t>
+        <w:t>Sistema de Gestión de Clínica Veterinaria</w:t>
       </w:r>
     </w:p>
     <w:p>
@@ -224,7 +224,7 @@
                 <w:color w:val="2C3E50"/>
                 <w:sz w:val="21"/>
               </w:rPr>
-              <w:t>Tecnicas de Programacion Orientada a Objetos</w:t>
+              <w:t>Técnicas de Programación Orientada a Objetos</w:t>
             </w:r>
           </w:p>
         </w:tc>
@@ -245,7 +245,7 @@
                 <w:color w:val="145A32"/>
                 <w:sz w:val="21"/>
               </w:rPr>
-              <w:t>Ciclo / Ano:</w:t>
+              <w:t>Ciclo / Año:</w:t>
             </w:r>
           </w:p>
         </w:tc>
@@ -310,7 +310,7 @@
           <w:color w:val="2C3E50"/>
           <w:sz w:val="21"/>
         </w:rPr>
-        <w:t>Introduccion</w:t>
+        <w:t>Introducción</w:t>
       </w:r>
       <w:r>
         <w:rPr>
@@ -330,7 +330,7 @@
           <w:color w:val="2C3E50"/>
           <w:sz w:val="21"/>
         </w:rPr>
-        <w:t>1.   Definicion del Problema</w:t>
+        <w:t>1.   Definición del Problema</w:t>
       </w:r>
       <w:r>
         <w:rPr>
@@ -370,7 +370,7 @@
           <w:color w:val="2C3E50"/>
           <w:sz w:val="21"/>
         </w:rPr>
-        <w:t>3.   Restricciones Realistas y Alternativas de Solucion</w:t>
+        <w:t>3.   Restricciones Realistas y Alternativas de Solución</w:t>
       </w:r>
       <w:r>
         <w:rPr>
@@ -410,7 +410,7 @@
           <w:color w:val="2C3E50"/>
           <w:sz w:val="21"/>
         </w:rPr>
-        <w:t>5.   Alcance de la Solucion</w:t>
+        <w:t>5.   Alcance de la Solución</w:t>
       </w:r>
       <w:r>
         <w:rPr>
@@ -490,7 +490,7 @@
           <w:color w:val="2C3E50"/>
           <w:sz w:val="21"/>
         </w:rPr>
-        <w:t>9.   Criterios de Aceptacion</w:t>
+        <w:t>9.   Criterios de Aceptación</w:t>
       </w:r>
       <w:r>
         <w:rPr>
@@ -510,7 +510,7 @@
           <w:color w:val="2C3E50"/>
           <w:sz w:val="21"/>
         </w:rPr>
-        <w:t>10.  Implementacion del Proyecto</w:t>
+        <w:t>10.  Implementación del Proyecto</w:t>
       </w:r>
       <w:r>
         <w:rPr>
@@ -570,7 +570,7 @@
           <w:color w:val="2C3E50"/>
           <w:sz w:val="21"/>
         </w:rPr>
-        <w:t>13.  Bibliografia</w:t>
+        <w:t>13.  Bibliografía</w:t>
       </w:r>
       <w:r>
         <w:rPr>
@@ -616,7 +616,7 @@
           <w:sz w:val="26"/>
         </w:rPr>
         <w:lastRenderedPageBreak/>
-        <w:t xml:space="preserve">  INTRODUCCION</w:t>
+        <w:t xml:space="preserve">  INTRODUCCIÓN</w:t>
       </w:r>
     </w:p>
     <w:p>
@@ -627,67 +627,7 @@
         <w:rPr>
           <w:color w:val="2C3E50"/>
         </w:rPr>
-        <w:t>VetCare es un sistema de gestion disenado para digitalizar y optimizar los procesos internos de las clinicas veterinarias de peque</w:t>
-      </w:r>
-      <w:r>
-        <w:rPr>
-          <w:color w:val="2C3E50"/>
-        </w:rPr>
-        <w:t>ñ</w:t>
-      </w:r>
-      <w:r>
-        <w:rPr>
-          <w:color w:val="2C3E50"/>
-        </w:rPr>
-        <w:t>o y mediano tama</w:t>
-      </w:r>
-      <w:r>
-        <w:rPr>
-          <w:color w:val="2C3E50"/>
-        </w:rPr>
-        <w:t>ñ</w:t>
-      </w:r>
-      <w:r>
-        <w:rPr>
-          <w:color w:val="2C3E50"/>
-        </w:rPr>
-        <w:t>o. Este proyecto surge de la necesidad de modernizar la gestion de pacientes animales, la programaci</w:t>
-      </w:r>
-      <w:r>
-        <w:rPr>
-          <w:color w:val="2C3E50"/>
-        </w:rPr>
-        <w:t>ó</w:t>
-      </w:r>
-      <w:r>
-        <w:rPr>
-          <w:color w:val="2C3E50"/>
-        </w:rPr>
-        <w:t>n de citas m</w:t>
-      </w:r>
-      <w:r>
-        <w:rPr>
-          <w:color w:val="2C3E50"/>
-        </w:rPr>
-        <w:t>é</w:t>
-      </w:r>
-      <w:r>
-        <w:rPr>
-          <w:color w:val="2C3E50"/>
-        </w:rPr>
-        <w:t>dicas y el mantenimiento de historiales clinicos que, en la mayoria de los establecimientos veterinarios del Per</w:t>
-      </w:r>
-      <w:r>
-        <w:rPr>
-          <w:color w:val="2C3E50"/>
-        </w:rPr>
-        <w:t>ú</w:t>
-      </w:r>
-      <w:r>
-        <w:rPr>
-          <w:color w:val="2C3E50"/>
-        </w:rPr>
-        <w:t>, aun se realizan de forma manual y desorganizada.</w:t>
+        <w:t>VetCare es un sistema de gestión diseñado para digitalizar y optimizar los procesos internos de las clínicas veterinarias de pequeño y mediano tamaño. Este proyecto surge de la necesidad de modernizar la gestión de pacientes animales, la programación de citas médicas y el mantenimiento de historiales clínicos que, en la mayoría de los establecimientos veterinarios del Perú, aún se realizan de forma manual y desorganizada.</w:t>
       </w:r>
     </w:p>
     <w:p>
@@ -698,7 +638,7 @@
         <w:rPr>
           <w:color w:val="2C3E50"/>
         </w:rPr>
-        <w:t>El sistema ha sido desarrollado en Java SE aplicando los principios de la Programacion Orientada a Objetos (POO). Este enfoque permite representar las entidades del negocio veterinario (mascotas, duenos, veterinarios y citas) como clases con atributos y metodos propios, garantizando un codigo modular, reutilizable y facil de mantener.</w:t>
+        <w:t>El sistema ha sido desarrollado en Java SE aplicando los principios de la Programación Orientada a Objetos (POO). Este enfoque permite representar las entidades del negocio veterinario (mascotas, dueños, veterinarios y citas) como clases con atributos y métodos propios, garantizando un código modular, reutilizable y fácil de mantener.</w:t>
       </w:r>
     </w:p>
     <w:p>
@@ -709,7 +649,7 @@
         <w:rPr>
           <w:color w:val="2C3E50"/>
         </w:rPr>
-        <w:t>El presente documento constituye el informe final del proyecto integrador e incluye la definicion del problema, los antecedentes, las restricciones con sus alternativas de solucion, los objetivos, el alcance funcional, los 40 requerimientos funcionales del sistema, las 10 historias de usuario, el diagrama de clases UML, los criterios de aceptacion, la descripcion de la implementacion en Java, los resultados obtenidos, las conclusiones, la bibliografia y los anexos con el codigo fuente y el enlace al repositorio GitHub.</w:t>
+        <w:t>El presente documento constituye el informe final del proyecto integrador e incluye la definición del problema, los antecedentes, las restricciones con sus alternativas de solución, los objetivos, el alcance funcional, los 40 requerimientos funcionales del sistema, las 10 historias de usuario, el diagrama de clases UML, los criterios de aceptación, la descripción de la implementación en Java, los resultados obtenidos, las conclusiones, la bibliografía y los anexos con el código fuente y el enlace al repositorio GitHub.</w:t>
       </w:r>
     </w:p>
     <w:p>
@@ -737,7 +677,7 @@
           <w:color w:val="FFFFFF"/>
           <w:sz w:val="26"/>
         </w:rPr>
-        <w:t>DEFINICION DEL PROBLEMA</w:t>
+        <w:t>DEFINICIÓN DEL PROBLEMA</w:t>
       </w:r>
     </w:p>
     <w:p/>
@@ -750,7 +690,7 @@
           <w:b/>
           <w:color w:val="145A32"/>
         </w:rPr>
-        <w:t xml:space="preserve">  1.1  Situacion Problematica</w:t>
+        <w:t xml:space="preserve">  1.1  Situación Problemática</w:t>
       </w:r>
     </w:p>
     <w:p>
@@ -762,7 +702,7 @@
         <w:rPr>
           <w:color w:val="2C3E50"/>
         </w:rPr>
-        <w:t>Las clinicas veterinarias de pequeno y mediano tamano en el Peru operan, en su mayoria, con procesos manuales que limitan su eficiencia operativa. El registro de mascotas, la programacion de citas y el mantenimiento del historial medico se realizan en cuadernos fisicos o planillas de Excel, lo que genera duplicidad de datos, perdida de informacion y demoras en la atencion.</w:t>
+        <w:t>Las clínicas veterinarias de pequeño y mediano tamaño en el Perú operan, en su mayoría, con procesos manuales que limitan su eficiencia operativa. El registro de mascotas, la programación de citas y el mantenimiento del historial médico se realizan en cuadernos físicos o planillas de Excel, lo que genera duplicidad de datos, pérdida de información y demoras en la atención.</w:t>
       </w:r>
     </w:p>
     <w:p>
@@ -774,7 +714,7 @@
         <w:rPr>
           <w:color w:val="2C3E50"/>
         </w:rPr>
-        <w:t>Esta situacion se agrava en periodos de alta demanda (campanas de vacunacion o desparasitacion masiva) donde la ausencia de un sistema organizado de citas provoca conflictos de horario y una atencion deficiente. Asimismo, la falta de un historial medico digital centralizado impide al veterinario acceder rapidamente al historial clinico del paciente durante la consulta.</w:t>
+        <w:t>Esta situación se agrava en periodos de alta demanda (campañas de vacunación o desparasitación masiva) donde la ausencia de un sistema organizado de citas provoca conflictos de horario y una atención deficiente. Asimismo, la falta de un historial médico digital centralizado impide al veterinario acceder rápidamente al historial clínico del paciente durante la consulta.</w:t>
       </w:r>
     </w:p>
     <w:p>
@@ -800,7 +740,23 @@
           <w:color w:val="145A32"/>
           <w:sz w:val="21"/>
         </w:rPr>
-        <w:t>De que manera el desarrollo de un sistema de gestion de clinica veterinaria en Java orientado a objetos puede digitalizar los procesos de registro de mascotas, programacion de citas e historial medico, mejorando la eficiencia operativa y la calidad de atencion de la clinica?</w:t>
+        <w:t>De qué manera el desarrollo de un sistema de gestión de clínica veterinaria en Java orientado a objetos puede digitalizar los procesos de registro de mascotas, programación de citas e historial médico, ¿mejorando la eficiencia operativa y la calidad de atención de la clínic</w:t>
+      </w:r>
+      <w:r>
+        <w:rPr>
+          <w:i/>
+          <w:color w:val="145A32"/>
+          <w:sz w:val="21"/>
+        </w:rPr>
+        <w:t>a</w:t>
+      </w:r>
+      <w:r>
+        <w:rPr>
+          <w:i/>
+          <w:color w:val="145A32"/>
+          <w:sz w:val="21"/>
+        </w:rPr>
+        <w:t>?</w:t>
       </w:r>
     </w:p>
     <w:p>
@@ -824,7 +780,7 @@
         <w:rPr>
           <w:color w:val="2C3E50"/>
         </w:rPr>
-        <w:t>Problema central: "Ineficiencia en la gestion de atencion de pacientes en clinicas veterinarias de pequeno tamano"</w:t>
+        <w:t>Problema central: "Ineficiencia en la gestión de atención de pacientes en clínicas veterinarias de pequeño tamaño"</w:t>
       </w:r>
     </w:p>
     <w:p>
@@ -856,7 +812,7 @@
           <w:color w:val="2C3E50"/>
           <w:sz w:val="21"/>
         </w:rPr>
-        <w:t>Falta de capacitacion tecnologica del personal</w:t>
+        <w:t>Falta de capacitación tecnológica del personal</w:t>
       </w:r>
     </w:p>
     <w:p>
@@ -876,7 +832,7 @@
           <w:color w:val="2C3E50"/>
           <w:sz w:val="21"/>
         </w:rPr>
-        <w:t>Resistencia al cambio y adopcion de herramientas digitales</w:t>
+        <w:t>Resistencia al cambio y adopción de herramientas digitales</w:t>
       </w:r>
     </w:p>
     <w:p>
@@ -896,7 +852,7 @@
           <w:color w:val="2C3E50"/>
           <w:sz w:val="21"/>
         </w:rPr>
-        <w:t>Escaso personal para atencion y administracion simultanea</w:t>
+        <w:t>Escaso personal para atención y administración simultánea</w:t>
       </w:r>
     </w:p>
     <w:p>
@@ -908,7 +864,7 @@
           <w:b/>
           <w:color w:val="145A32"/>
         </w:rPr>
-        <w:t xml:space="preserve">    Metodo:</w:t>
+        <w:t xml:space="preserve">    Método:</w:t>
       </w:r>
     </w:p>
     <w:p>
@@ -948,7 +904,7 @@
           <w:color w:val="2C3E50"/>
           <w:sz w:val="21"/>
         </w:rPr>
-        <w:t>Programacion de citas sin sistema de confirmacion</w:t>
+        <w:t>Programación de citas sin sistema de confirmación</w:t>
       </w:r>
     </w:p>
     <w:p>
@@ -968,7 +924,7 @@
           <w:color w:val="2C3E50"/>
           <w:sz w:val="21"/>
         </w:rPr>
-        <w:t>Sin proceso de seguimiento post-consulta al dueno</w:t>
+        <w:t>Sin proceso de seguimiento post-consulta al dueño</w:t>
       </w:r>
     </w:p>
     <w:p>
@@ -980,7 +936,7 @@
           <w:b/>
           <w:color w:val="145A32"/>
         </w:rPr>
-        <w:t xml:space="preserve">    Tecnologia:</w:t>
+        <w:t xml:space="preserve">    Tecnología:</w:t>
       </w:r>
     </w:p>
     <w:p>
@@ -1020,7 +976,7 @@
           <w:color w:val="2C3E50"/>
           <w:sz w:val="21"/>
         </w:rPr>
-        <w:t>Dependencia de cuadernos fisicos y hojas de calculo</w:t>
+        <w:t>Dependencia de cuadernos físicos y hojas de cálculo</w:t>
       </w:r>
     </w:p>
     <w:p>
@@ -1040,7 +996,7 @@
           <w:color w:val="2C3E50"/>
           <w:sz w:val="21"/>
         </w:rPr>
-        <w:t>Sin acceso a historial medico digital en tiempo real</w:t>
+        <w:t>Sin acceso a historial médico digital en tiempo real</w:t>
       </w:r>
     </w:p>
     <w:p>
@@ -1052,7 +1008,7 @@
           <w:b/>
           <w:color w:val="145A32"/>
         </w:rPr>
-        <w:t xml:space="preserve">    Duenos:</w:t>
+        <w:t xml:space="preserve">    Dueños:</w:t>
       </w:r>
     </w:p>
     <w:p>
@@ -1072,7 +1028,7 @@
           <w:color w:val="2C3E50"/>
           <w:sz w:val="21"/>
         </w:rPr>
-        <w:t>Sin recordatorios automaticos de citas o vacunas</w:t>
+        <w:t>Sin recordatorios automáticos de citas o vacunas</w:t>
       </w:r>
     </w:p>
     <w:p>
@@ -1112,7 +1068,7 @@
           <w:color w:val="2C3E50"/>
           <w:sz w:val="21"/>
         </w:rPr>
-        <w:t>Sin canal de comunicacion directo con la clinica</w:t>
+        <w:t>Sin canal de comunicación directo con la clínica</w:t>
       </w:r>
     </w:p>
     <w:p>
@@ -1125,7 +1081,7 @@
           <w:color w:val="145A32"/>
         </w:rPr>
         <w:lastRenderedPageBreak/>
-        <w:t xml:space="preserve">    Historial medico:</w:t>
+        <w:t xml:space="preserve">    Historial médico:</w:t>
       </w:r>
     </w:p>
     <w:p>
@@ -1165,7 +1121,7 @@
           <w:color w:val="2C3E50"/>
           <w:sz w:val="21"/>
         </w:rPr>
-        <w:t>Informacion dispersa y sin centralizacion</w:t>
+        <w:t>Información dispersa y sin centralización</w:t>
       </w:r>
     </w:p>
     <w:p>
@@ -1185,7 +1141,7 @@
           <w:color w:val="2C3E50"/>
           <w:sz w:val="21"/>
         </w:rPr>
-        <w:t>Riesgo de perdida de datos ante extravios o siniestros</w:t>
+        <w:t>Riesgo de pérdida de datos ante extravíos o siniestros</w:t>
       </w:r>
     </w:p>
     <w:p>
@@ -1217,7 +1173,7 @@
           <w:color w:val="2C3E50"/>
           <w:sz w:val="21"/>
         </w:rPr>
-        <w:t>Cobros manuales sin registro sistematico</w:t>
+        <w:t>Cobros manuales sin registro sistemático</w:t>
       </w:r>
     </w:p>
     <w:p>
@@ -1269,7 +1225,7 @@
         <w:rPr>
           <w:color w:val="2C3E50"/>
         </w:rPr>
-        <w:t>El diagrama completo de causa-efecto se presenta a continuacion:</w:t>
+        <w:t>El diagrama completo de causa-efecto se presenta a continuación:</w:t>
       </w:r>
     </w:p>
     <w:p>
@@ -1281,7 +1237,7 @@
           <w:noProof/>
         </w:rPr>
         <w:drawing>
-          <wp:inline distT="0" distB="0" distL="0" distR="0" wp14:anchorId="3ABD8288" wp14:editId="1345782C">
+          <wp:inline distT="0" distB="0" distL="0" distR="0" wp14:anchorId="0866BE14" wp14:editId="6896C507">
             <wp:extent cx="5040000" cy="2797725"/>
             <wp:effectExtent l="0" t="0" r="0" b="0"/>
             <wp:docPr id="1" name="Picture 1"/>
@@ -1367,7 +1323,7 @@
         <w:rPr>
           <w:color w:val="2C3E50"/>
         </w:rPr>
-        <w:t>A continuacion se presentan tres antecedentes que respaldan el desarrollo de VetCare desde perspectivas internacional, nacional y tecnologica.</w:t>
+        <w:t>A continuación, se presentan tres antecedentes que respaldan el desarrollo de VetCare desde perspectivas internacional, nacional y tecnológica.</w:t>
       </w:r>
     </w:p>
     <w:p>
@@ -1392,7 +1348,7 @@
           <w:color w:val="5D6D7E"/>
           <w:sz w:val="20"/>
         </w:rPr>
-        <w:t>Barrientos, J., &amp; Molina, P. (2020). Sistema de informacion para la gestion de clinicas veterinarias. Repositorio Universidad de Guayaquil, Ecuador.</w:t>
+        <w:t>Barrientos, J., &amp; Molina, P. (2020). Sistema de información para la gestión de clínicas veterinarias. Repositorio Universidad de Guayaquil, Ecuador.</w:t>
       </w:r>
     </w:p>
     <w:p>
@@ -1404,7 +1360,7 @@
         <w:rPr>
           <w:color w:val="2C3E50"/>
         </w:rPr>
-        <w:t>Este trabajo implemento un sistema de escritorio en Java para automatizar el registro de pacientes animales y la gestion de citas en clinicas veterinarias de Guayaquil, Ecuador. Los resultados evidenciaron una reduccion del 70% en el tiempo de registro de pacientes y una mejora significativa en la organizacion del historial medico. El proyecto guarda similitud directa con VetCare en cuanto al uso de Java y la gestion de citas como modulo central.</w:t>
+        <w:t>Este trabajo implementó un sistema de escritorio en Java para automatizar el registro de pacientes animales y la gestión de citas en clínicas veterinarias de Guayaquil, Ecuador. Los resultados evidenciaron una reducción del 70% en el tiempo de registro de pacientes y una mejora significativa en la organización del historial médico. El proyecto guarda similitud directa con VetCare en cuanto al uso de Java y la gestión de citas como módulo central.</w:t>
       </w:r>
     </w:p>
     <w:p>
@@ -1429,7 +1385,7 @@
           <w:color w:val="5D6D7E"/>
           <w:sz w:val="20"/>
         </w:rPr>
-        <w:t>Quispe, A., &amp; Vargas, L. (2023). Desarrollo de software de escritorio para la gestion de consultas en clinicas veterinarias de Lima Metropolitana. Repositorio Institucional USIL, Lima, Peru.</w:t>
+        <w:t>Quispe, A., &amp; Vargas, L. (2023). Desarrollo de software de escritorio para la gestión de consultas en clínicas veterinarias de Lima Metropolitana. Repositorio Institucional USIL, Lima, Perú.</w:t>
       </w:r>
     </w:p>
     <w:p>
@@ -1441,7 +1397,7 @@
         <w:rPr>
           <w:color w:val="2C3E50"/>
         </w:rPr>
-        <w:t>Este estudio desarrollo una aplicacion de escritorio para la clinica veterinaria 'Patitas Felices' en el distrito de San Borja, Lima. El sistema implementado redujo los errores en el registro de citas en un 85% y permitio centralizar el historial medico de mas de 500 mascotas. Los autores destacan que el uso de POO facilito la escalabilidad del sistema, alinandose con la propuesta arquitectonica de VetCare.</w:t>
+        <w:t>Este estudio desarrolló una aplicación de escritorio para la clínica veterinaria 'Patitas Felices' en el distrito de San Borja, Lima. El sistema implementado redujo los errores en el registro de citas en un 85% y permitió centralizar el historial médico de más de 500 mascotas. Los autores destacan que el uso de POO facilitó la escalabilidad del sistema, alineándose con la propuesta arquitectónica de VetCare.</w:t>
       </w:r>
     </w:p>
     <w:p>
@@ -1453,7 +1409,7 @@
           <w:b/>
           <w:color w:val="145A32"/>
         </w:rPr>
-        <w:t xml:space="preserve">  Antecedente Tecnologico</w:t>
+        <w:t xml:space="preserve">  Antecedente Tecnológico</w:t>
       </w:r>
     </w:p>
     <w:p>
@@ -1466,7 +1422,7 @@
           <w:color w:val="5D6D7E"/>
           <w:sz w:val="20"/>
         </w:rPr>
-        <w:t>Deitel, P. J., &amp; Deitel, H. M. (2012). Java: Como programar (9.a ed.). Pearson Educacion.</w:t>
+        <w:t>Deitel, P. J., &amp; Deitel, H. M. (2012). Java: Como programar (9.a ed.). Pearson Educación.</w:t>
       </w:r>
     </w:p>
     <w:p>
@@ -1478,7 +1434,7 @@
         <w:rPr>
           <w:color w:val="2C3E50"/>
         </w:rPr>
-        <w:t>Esta referencia canonica del lenguaje Java fundamenta el paradigma de la Programacion Orientada a Objetos como base para el desarrollo de sistemas de gestion. Los autores demuestran que la representacion de entidades del mundo real (mascotas, medicos, citas) como clases con atributos y metodos propios constituye la estrategia optima para sistemas de escritorio escalables y mantenibles.</w:t>
+        <w:t>Esta referencia canónica del lenguaje Java fundamenta el paradigma de la Programación Orientada a Objetos como base para el desarrollo de sistemas de gestión. Los autores demuestran que la representación de entidades del mundo real (mascotas, médicos, citas) como clases con atributos y métodos propios constituye la estrategia óptima para sistemas de escritorio escalables y mantenibles.</w:t>
       </w:r>
     </w:p>
     <w:p>
@@ -1506,7 +1462,7 @@
           <w:color w:val="FFFFFF"/>
           <w:sz w:val="26"/>
         </w:rPr>
-        <w:t>RESTRICCIONES REALISTAS Y ALTERNATIVAS DE SOLUCION</w:t>
+        <w:t>RESTRICCIONES REALISTAS Y ALTERNATIVAS DE SOLUCIÓN</w:t>
       </w:r>
     </w:p>
     <w:p/>
@@ -1518,7 +1474,7 @@
         <w:rPr>
           <w:color w:val="2C3E50"/>
         </w:rPr>
-        <w:t>A continuacion se identifican las restricciones que afectan el desarrollo del proyecto VetCare, organizadas por categoria, junto con las alternativas de solucion propuestas para cada caso.</w:t>
+        <w:t>A continuación, se identifican las restricciones que afectan el desarrollo del proyecto VetCare, organizadas por categoría, junto con las alternativas de solución propuestas para cada caso.</w:t>
       </w:r>
     </w:p>
     <w:p>
@@ -1530,7 +1486,7 @@
           <w:b/>
           <w:color w:val="145A32"/>
         </w:rPr>
-        <w:t xml:space="preserve">  3.1  Restricciones Tecnicas</w:t>
+        <w:t xml:space="preserve">  3.1  Restricciones Técnicas</w:t>
       </w:r>
     </w:p>
     <w:tbl>
@@ -1558,7 +1514,7 @@
                 <w:color w:val="C0392B"/>
                 <w:sz w:val="20"/>
               </w:rPr>
-              <w:t xml:space="preserve">Restriccion:  </w:t>
+              <w:t xml:space="preserve">Restricción:  </w:t>
             </w:r>
             <w:r>
               <w:rPr>
@@ -1586,14 +1542,14 @@
                 <w:color w:val="145A32"/>
                 <w:sz w:val="20"/>
               </w:rPr>
-              <w:t xml:space="preserve">Alternativa de solucion:  </w:t>
+              <w:t xml:space="preserve">Alternativa de solución:  </w:t>
             </w:r>
             <w:r>
               <w:rPr>
                 <w:color w:val="2C3E50"/>
                 <w:sz w:val="20"/>
               </w:rPr>
-              <w:t>Se aprovechan al maximo las librerias estandar de Java (java.util, java.io, java.time). En fases futuras se podria incorporar JDBC para acceso a base de datos sin cambiar el lenguaje.</w:t>
+              <w:t>Se aprovechan al máximo las librerías estándar de Java (java.util, java.io, java.time). En fases futuras se podría incorporar JDBC para acceso a base de datos sin cambiar el lenguaje.</w:t>
             </w:r>
           </w:p>
         </w:tc>
@@ -1629,7 +1585,7 @@
                 <w:color w:val="C0392B"/>
                 <w:sz w:val="20"/>
               </w:rPr>
-              <w:t xml:space="preserve">Restriccion:  </w:t>
+              <w:t xml:space="preserve">Restricción:  </w:t>
             </w:r>
             <w:r>
               <w:rPr>
@@ -1657,14 +1613,14 @@
                 <w:color w:val="145A32"/>
                 <w:sz w:val="20"/>
               </w:rPr>
-              <w:t xml:space="preserve">Alternativa de solucion:  </w:t>
+              <w:t xml:space="preserve">Alternativa de solución:  </w:t>
             </w:r>
             <w:r>
               <w:rPr>
                 <w:color w:val="2C3E50"/>
                 <w:sz w:val="20"/>
               </w:rPr>
-              <w:t>Se implementa un gestor de archivos robusto con manejo de errores (try-catch) y separadores de campo definidos. En versiones posteriores se podria migrar a SQLite embebido sin cambiar la arquitectura.</w:t>
+              <w:t>Se implementa un gestor de archivos robusto con manejo de errores (try-catch) y separadores de campo definidos. En versiones posteriores se podría migrar a SQLite embebido sin cambiar la arquitectura.</w:t>
             </w:r>
           </w:p>
         </w:tc>
@@ -1700,13 +1656,7 @@
                 <w:color w:val="C0392B"/>
                 <w:sz w:val="20"/>
               </w:rPr>
-              <w:t xml:space="preserve">Restriccion:  </w:t>
-            </w:r>
-            <w:r>
-              <w:rPr>
-                <w:color w:val="2C3E50"/>
-                <w:sz w:val="20"/>
-              </w:rPr>
+              <w:t xml:space="preserve">Restricción:  </w:t>
             </w:r>
           </w:p>
         </w:tc>
@@ -1727,14 +1677,14 @@
                 <w:color w:val="145A32"/>
                 <w:sz w:val="20"/>
               </w:rPr>
-              <w:t xml:space="preserve">Alternativa de solucion:  </w:t>
+              <w:t xml:space="preserve">Alternativa de solución:  </w:t>
             </w:r>
             <w:r>
               <w:rPr>
                 <w:color w:val="2C3E50"/>
                 <w:sz w:val="20"/>
               </w:rPr>
-              <w:t>Se disenan menus numerados intuitivos con validaciones en cada entrada y mensajes de error descriptivos, logrando una experiencia de usuario clara a pesar de la limitacion grafica.</w:t>
+              <w:t>Se diseñan menús numerados intuitivos con validaciones en cada entrada y mensajes de error descriptivos, logrando una experiencia de usuario clara a pesar de la limitación grafica.</w:t>
             </w:r>
           </w:p>
         </w:tc>
@@ -1770,7 +1720,7 @@
                 <w:color w:val="C0392B"/>
                 <w:sz w:val="20"/>
               </w:rPr>
-              <w:t xml:space="preserve">Restriccion:  </w:t>
+              <w:t xml:space="preserve">Restricción:  </w:t>
             </w:r>
             <w:r>
               <w:rPr>
@@ -1798,14 +1748,14 @@
                 <w:color w:val="145A32"/>
                 <w:sz w:val="20"/>
               </w:rPr>
-              <w:t xml:space="preserve">Alternativa de solucion:  </w:t>
+              <w:t xml:space="preserve">Alternativa de solución:  </w:t>
             </w:r>
             <w:r>
               <w:rPr>
                 <w:color w:val="2C3E50"/>
                 <w:sz w:val="20"/>
               </w:rPr>
-              <w:t>El codigo es compatible con IntelliJ IDEA Community Edition y VS Code con extension Java.</w:t>
+              <w:t>El código es compatible con IntelliJ IDEA Community Edition y VS Code con extensión Java.</w:t>
             </w:r>
           </w:p>
         </w:tc>
@@ -1841,7 +1791,7 @@
                 <w:color w:val="C0392B"/>
                 <w:sz w:val="20"/>
               </w:rPr>
-              <w:t xml:space="preserve">Restriccion:  </w:t>
+              <w:t xml:space="preserve">Restricción:  </w:t>
             </w:r>
             <w:r>
               <w:rPr>
@@ -1869,7 +1819,7 @@
                 <w:color w:val="145A32"/>
                 <w:sz w:val="20"/>
               </w:rPr>
-              <w:t xml:space="preserve">Alternativa de solucion:  </w:t>
+              <w:t xml:space="preserve">Alternativa de solución:  </w:t>
             </w:r>
             <w:r>
               <w:rPr>
@@ -1896,7 +1846,7 @@
           <w:b/>
           <w:color w:val="145A32"/>
         </w:rPr>
-        <w:t xml:space="preserve">  3.2  Restricciones Economicas</w:t>
+        <w:t xml:space="preserve">  3.2  Restricciones Económicas</w:t>
       </w:r>
     </w:p>
     <w:tbl>
@@ -1924,7 +1874,7 @@
                 <w:color w:val="C0392B"/>
                 <w:sz w:val="20"/>
               </w:rPr>
-              <w:t xml:space="preserve">Restriccion:  </w:t>
+              <w:t xml:space="preserve">Restricción:  </w:t>
             </w:r>
             <w:r>
               <w:rPr>
@@ -1952,14 +1902,14 @@
                 <w:color w:val="145A32"/>
                 <w:sz w:val="20"/>
               </w:rPr>
-              <w:t xml:space="preserve">Alternativa de solucion:  </w:t>
+              <w:t xml:space="preserve">Alternativa de solución:  </w:t>
             </w:r>
             <w:r>
               <w:rPr>
                 <w:color w:val="2C3E50"/>
                 <w:sz w:val="20"/>
               </w:rPr>
-              <w:t>Las versiones Community Edition de IntelliJ IDEA ofrecen funciones avanzadas de refactorizacion sin costo. Oracle Cloud Free Tier tambien puede usarse para pruebas de despliegue sin presupuesto.</w:t>
+              <w:t>Las versiones Community Edition de IntelliJ IDEA ofrecen funciones avanzadas de refactorización sin costo. Oracle Cloud Free Tier también puede usarse para pruebas de despliegue sin presupuesto.</w:t>
             </w:r>
           </w:p>
         </w:tc>
@@ -1996,7 +1946,7 @@
                 <w:sz w:val="20"/>
               </w:rPr>
               <w:lastRenderedPageBreak/>
-              <w:t xml:space="preserve">Restriccion:  </w:t>
+              <w:t xml:space="preserve">Restricción:  </w:t>
             </w:r>
             <w:r>
               <w:rPr>
@@ -2024,14 +1974,14 @@
                 <w:color w:val="145A32"/>
                 <w:sz w:val="20"/>
               </w:rPr>
-              <w:t xml:space="preserve">Alternativa de solucion:  </w:t>
+              <w:t xml:space="preserve">Alternativa de solución:  </w:t>
             </w:r>
             <w:r>
               <w:rPr>
                 <w:color w:val="2C3E50"/>
                 <w:sz w:val="20"/>
               </w:rPr>
-              <w:t>GitHub provee repositorios publicos y GitHub Actions (CI) gratuitos, cubriendo las necesidades de control de versiones y automatizacion sin costo alguno.</w:t>
+              <w:t>GitHub provee repositorios públicos y GitHub Actions (CI) gratuitos, cubriendo las necesidades de control de versiones y automatización sin costo alguno.</w:t>
             </w:r>
           </w:p>
         </w:tc>
@@ -2067,7 +2017,7 @@
                 <w:color w:val="C0392B"/>
                 <w:sz w:val="20"/>
               </w:rPr>
-              <w:t xml:space="preserve">Restriccion:  </w:t>
+              <w:t xml:space="preserve">Restricción:  </w:t>
             </w:r>
             <w:r>
               <w:rPr>
@@ -2095,14 +2045,14 @@
                 <w:color w:val="145A32"/>
                 <w:sz w:val="20"/>
               </w:rPr>
-              <w:t xml:space="preserve">Alternativa de solucion:  </w:t>
+              <w:t xml:space="preserve">Alternativa de solución:  </w:t>
             </w:r>
             <w:r>
               <w:rPr>
                 <w:color w:val="2C3E50"/>
                 <w:sz w:val="20"/>
               </w:rPr>
-              <w:t>Los laboratorios de computo de la universidad estan disponibles para sesiones colaborativas presenciales cuando el equipo personal no este disponible.</w:t>
+              <w:t>Los laboratorios de cómputo de la universidad están disponibles para sesiones colaborativas presenciales cuando el equipo personal no esté disponible.</w:t>
             </w:r>
           </w:p>
         </w:tc>
@@ -2150,14 +2100,14 @@
                 <w:color w:val="C0392B"/>
                 <w:sz w:val="20"/>
               </w:rPr>
-              <w:t xml:space="preserve">Restriccion:  </w:t>
+              <w:t xml:space="preserve">Restricción:  </w:t>
             </w:r>
             <w:r>
               <w:rPr>
                 <w:color w:val="2C3E50"/>
                 <w:sz w:val="20"/>
               </w:rPr>
-              <w:t>El tiempo de desarrollo esta limitado al ciclo academico 2026, con entregas parciales semanales.</w:t>
+              <w:t>El tiempo de desarrollo está limitado al ciclo académico 2026, con entregas parciales semanales.</w:t>
             </w:r>
           </w:p>
         </w:tc>
@@ -2178,14 +2128,14 @@
                 <w:color w:val="145A32"/>
                 <w:sz w:val="20"/>
               </w:rPr>
-              <w:t xml:space="preserve">Alternativa de solucion:  </w:t>
+              <w:t xml:space="preserve">Alternativa de solución:  </w:t>
             </w:r>
             <w:r>
               <w:rPr>
                 <w:color w:val="2C3E50"/>
                 <w:sz w:val="20"/>
               </w:rPr>
-              <w:t>Se aplica una estrategia de priorizacion por modulos (MVP): primero mascotas, citas e historial; el modulo de reportes y autenticacion se integra en la fase final del ciclo.</w:t>
+              <w:t>Se aplica una estrategia de priorización por módulos (MVP): primero mascotas, citas e historial; el módulo de reportes y autenticación se integra en la fase final del ciclo.</w:t>
             </w:r>
           </w:p>
         </w:tc>
@@ -2221,14 +2171,14 @@
                 <w:color w:val="C0392B"/>
                 <w:sz w:val="20"/>
               </w:rPr>
-              <w:t xml:space="preserve">Restriccion:  </w:t>
+              <w:t xml:space="preserve">Restricción:  </w:t>
             </w:r>
             <w:r>
               <w:rPr>
                 <w:color w:val="2C3E50"/>
                 <w:sz w:val="20"/>
               </w:rPr>
-              <w:t>Los integrantes tienen carga academica paralela, lo que limita la dedicacion exclusiva al proyecto.</w:t>
+              <w:t>Los integrantes tienen carga académica paralela, lo que limita la dedicación exclusiva al proyecto.</w:t>
             </w:r>
           </w:p>
         </w:tc>
@@ -2249,14 +2199,14 @@
                 <w:color w:val="145A32"/>
                 <w:sz w:val="20"/>
               </w:rPr>
-              <w:t xml:space="preserve">Alternativa de solucion:  </w:t>
+              <w:t xml:space="preserve">Alternativa de solución:  </w:t>
             </w:r>
             <w:r>
               <w:rPr>
                 <w:color w:val="2C3E50"/>
                 <w:sz w:val="20"/>
               </w:rPr>
-              <w:t>Se establecen reuniones semanales cortas de sincronizacion y se usa comunicacion asincrona para resolver bloqueos sin necesidad de reuniones adicionales.</w:t>
+              <w:t>Se establecen reuniones semanales cortas de sincronización y se usa comunicación asíncrona para resolver bloqueos sin necesidad de reuniones adicionales.</w:t>
             </w:r>
           </w:p>
         </w:tc>
@@ -2292,14 +2242,14 @@
                 <w:color w:val="C0392B"/>
                 <w:sz w:val="20"/>
               </w:rPr>
-              <w:t xml:space="preserve">Restriccion:  </w:t>
+              <w:t xml:space="preserve">Restricción:  </w:t>
             </w:r>
             <w:r>
               <w:rPr>
                 <w:color w:val="2C3E50"/>
                 <w:sz w:val="20"/>
               </w:rPr>
-              <w:t>El sistema no incluye integracion con sistemas externos (SUNAT, pasarelas de pago, APIs de terceros).</w:t>
+              <w:t>El sistema no incluye integración con sistemas externos (SUNAT, pasarelas de pago, APIs de terceros).</w:t>
             </w:r>
           </w:p>
         </w:tc>
@@ -2320,14 +2270,14 @@
                 <w:color w:val="145A32"/>
                 <w:sz w:val="20"/>
               </w:rPr>
-              <w:t xml:space="preserve">Alternativa de solucion:  </w:t>
+              <w:t xml:space="preserve">Alternativa de solución:  </w:t>
             </w:r>
             <w:r>
               <w:rPr>
                 <w:color w:val="2C3E50"/>
                 <w:sz w:val="20"/>
               </w:rPr>
-              <w:t>El diseno de clases contempla interfaces preparadas para futura integracion REST, de modo que agregar conectores externos en versiones posteriores no requiera refactorizacion mayor.</w:t>
+              <w:t>El diseño de clases contempla interfaces preparadas para futura integración REST, de modo que agregar conectores externos en versiones posteriores no requiera refactorización mayor.</w:t>
             </w:r>
           </w:p>
         </w:tc>
@@ -2363,14 +2313,14 @@
                 <w:color w:val="C0392B"/>
                 <w:sz w:val="20"/>
               </w:rPr>
-              <w:t xml:space="preserve">Restriccion:  </w:t>
+              <w:t xml:space="preserve">Restricción:  </w:t>
             </w:r>
             <w:r>
               <w:rPr>
                 <w:color w:val="2C3E50"/>
                 <w:sz w:val="20"/>
               </w:rPr>
-              <w:t>El modulo de recordatorios automaticos por correo o SMS queda fuera del alcance del ciclo.</w:t>
+              <w:t>El módulo de recordatorios automáticos por correo o SMS queda fuera del alcance del ciclo.</w:t>
             </w:r>
           </w:p>
         </w:tc>
@@ -2391,14 +2341,14 @@
                 <w:color w:val="145A32"/>
                 <w:sz w:val="20"/>
               </w:rPr>
-              <w:t xml:space="preserve">Alternativa de solucion:  </w:t>
+              <w:t xml:space="preserve">Alternativa de solución:  </w:t>
             </w:r>
             <w:r>
               <w:rPr>
                 <w:color w:val="2C3E50"/>
                 <w:sz w:val="20"/>
               </w:rPr>
-              <w:t>Se implementa una funcion de 'agenda del dia' que el recepcionista consulta al iniciar la jornada.</w:t>
+              <w:t>Se implementa una función de 'agenda del día' que el recepcionista consulta al iniciar la jornada.</w:t>
             </w:r>
           </w:p>
         </w:tc>
@@ -2459,7 +2409,7 @@
         <w:rPr>
           <w:color w:val="2C3E50"/>
         </w:rPr>
-        <w:t>Desarrollar un sistema de gestion de clinica veterinaria denominado "VetCare" en Java orientado a objetos, que digitalice los procesos de registro de mascotas, gestion de citas medicas e historial clinico, mejorando la eficiencia operativa y la calidad de atencion de la clinica.</w:t>
+        <w:t>Desarrollar un sistema de gestión de clínica veterinaria denominado "VetCare" en Java orientado a objetos, que digitalice los procesos de registro de mascotas, gestión de citas médicas e historial clínico, mejorando la eficiencia operativa y la calidad de atención de la clínica.</w:t>
       </w:r>
     </w:p>
     <w:p>
@@ -2471,7 +2421,7 @@
           <w:b/>
           <w:color w:val="145A32"/>
         </w:rPr>
-        <w:t xml:space="preserve">  4.2  Objetivos Especificos</w:t>
+        <w:t xml:space="preserve">  4.2  Objetivos Específicos</w:t>
       </w:r>
     </w:p>
     <w:tbl>
@@ -2519,7 +2469,7 @@
                 <w:color w:val="FFFFFF"/>
                 <w:sz w:val="20"/>
               </w:rPr>
-              <w:t>Objetivo Especifico</w:t>
+              <w:t>Objetivo Específico</w:t>
             </w:r>
           </w:p>
         </w:tc>
@@ -2552,7 +2502,7 @@
                 <w:color w:val="2C3E50"/>
                 <w:sz w:val="20"/>
               </w:rPr>
-              <w:t>Implementar un modulo de gestion de mascotas que permita registrar, consultar y mantener el historial medico de cada paciente animal.</w:t>
+              <w:t>Implementar un módulo de gestión de mascotas que permita registrar, consultar y mantener el historial médico de cada paciente animal.</w:t>
             </w:r>
           </w:p>
         </w:tc>
@@ -2585,7 +2535,7 @@
                 <w:color w:val="2C3E50"/>
                 <w:sz w:val="20"/>
               </w:rPr>
-              <w:t>Desarrollar un modulo de gestion de citas que organice la programacion de atenciones veterinarias con control de conflictos de horario.</w:t>
+              <w:t>Desarrollar un módulo de gestión de citas que organice la programación de atenciones veterinarias con control de conflictos de horario.</w:t>
             </w:r>
           </w:p>
         </w:tc>
@@ -2618,7 +2568,7 @@
                 <w:color w:val="2C3E50"/>
                 <w:sz w:val="20"/>
               </w:rPr>
-              <w:t>Crear un modulo de gestion de clientes (duenos) que centralice la informacion de contacto y su vinculacion con las mascotas registradas.</w:t>
+              <w:t>Crear un módulo de gestión de clientes (dueños) que centralice la información de contacto y su vinculación con las mascotas registradas.</w:t>
             </w:r>
           </w:p>
         </w:tc>
@@ -2651,7 +2601,7 @@
                 <w:color w:val="2C3E50"/>
                 <w:sz w:val="20"/>
               </w:rPr>
-              <w:t>Disenar un diagrama de clases UML que aplique herencia (Animal: Perro, Gato, Ave), composicion y asociacion entre las entidades del sistema.</w:t>
+              <w:t>Diseñar un diagrama de clases UML que aplique herencia (Animal: Perro, Gato, Ave), composición y asociación entre las entidades del sistema.</w:t>
             </w:r>
           </w:p>
         </w:tc>
@@ -2684,7 +2634,7 @@
                 <w:color w:val="2C3E50"/>
                 <w:sz w:val="20"/>
               </w:rPr>
-              <w:t>Aplicar principios de POO (herencia, encapsulamiento, sobrecarga de metodos) y colecciones ArrayList para estructurar el codigo de forma modular y escalable.</w:t>
+              <w:t>Aplicar principios de POO (herencia, encapsulamiento, sobrecarga de métodos) y colecciones ArrayList para estructurar el código de forma modular y escalable.</w:t>
             </w:r>
           </w:p>
         </w:tc>
@@ -2717,7 +2667,7 @@
                 <w:color w:val="2C3E50"/>
                 <w:sz w:val="20"/>
               </w:rPr>
-              <w:t>Implementar persistencia de datos mediante archivos .txt con lectura y escritura en formato UTF-8 para conservar la informacion entre sesiones del sistema.</w:t>
+              <w:t>Implementar persistencia de datos mediante archivos .txt con lectura y escritura en formato UTF-8 para conservar la información entre sesiones del sistema.</w:t>
             </w:r>
           </w:p>
         </w:tc>
@@ -2748,7 +2698,7 @@
           <w:color w:val="FFFFFF"/>
           <w:sz w:val="26"/>
         </w:rPr>
-        <w:t>ALCANCE DE LA SOLUCION</w:t>
+        <w:t>ALCANCE DE LA SOLUCIÓN</w:t>
       </w:r>
     </w:p>
     <w:p/>
@@ -2760,7 +2710,7 @@
         <w:rPr>
           <w:color w:val="2C3E50"/>
         </w:rPr>
-        <w:t>El alcance define con precision que funcionalidades incluye VetCare en el ciclo 2026 y cuales quedan fuera del desarrollo actual.</w:t>
+        <w:t>El alcance define con precisión que funcionalidades incluye VetCare en el ciclo 2026 y cuales quedan fuera del desarrollo actual.</w:t>
       </w:r>
     </w:p>
     <w:p>
@@ -2792,7 +2742,7 @@
           <w:color w:val="2C3E50"/>
           <w:sz w:val="21"/>
         </w:rPr>
-        <w:t>Modulo de autenticacion con login (usuario admin / recepcionista).</w:t>
+        <w:t>Módulo de autenticación con login (usuario admin / recepcionista).</w:t>
       </w:r>
     </w:p>
     <w:p>
@@ -2812,7 +2762,7 @@
           <w:color w:val="2C3E50"/>
           <w:sz w:val="21"/>
         </w:rPr>
-        <w:t>Gestion completa de mascotas: registro, eliminacion, busqueda por nombre y filtrado por especie.</w:t>
+        <w:t>Gestión completa de mascotas: registro, eliminación, búsqueda por nombre y filtrado por especie.</w:t>
       </w:r>
     </w:p>
     <w:p>
@@ -2832,7 +2782,7 @@
           <w:color w:val="2C3E50"/>
           <w:sz w:val="21"/>
         </w:rPr>
-        <w:t>Clasificacion de mascotas por especie con herencia UML (Perro, Gato, Ave).</w:t>
+        <w:t>Clasificación de mascotas por especie con herencia UML (Perro, Gato, Ave).</w:t>
       </w:r>
     </w:p>
     <w:p>
@@ -2852,7 +2802,7 @@
           <w:color w:val="2C3E50"/>
           <w:sz w:val="21"/>
         </w:rPr>
-        <w:t>Gestion de duenos: registro, listado, busqueda por DNI e historial de mascotas asociadas.</w:t>
+        <w:t>Gestión de dueños: registro, listado, búsqueda por DNI e historial de mascotas asociadas.</w:t>
       </w:r>
     </w:p>
     <w:p>
@@ -2872,7 +2822,7 @@
           <w:color w:val="2C3E50"/>
           <w:sz w:val="21"/>
         </w:rPr>
-        <w:t>Gestion de medicos veterinarios: registro, listado, agenda de citas y desactivacion.</w:t>
+        <w:t>Gestión de médicos veterinarios: registro, listado, agenda de citas y desactivación.</w:t>
       </w:r>
     </w:p>
     <w:p>
@@ -2892,7 +2842,7 @@
           <w:color w:val="2C3E50"/>
           <w:sz w:val="21"/>
         </w:rPr>
-        <w:t>Gestion de citas: agendado con deteccion de conflictos, cancelacion y confirmacion de asistencia.</w:t>
+        <w:t>Gestión de citas: agendado con detección de conflictos, cancelación y confirmación de asistencia.</w:t>
       </w:r>
     </w:p>
     <w:p>
@@ -2912,7 +2862,7 @@
           <w:color w:val="2C3E50"/>
           <w:sz w:val="21"/>
         </w:rPr>
-        <w:t>Registro de consultas medicas: diagnostico, tratamiento y observaciones (sobrecarga de constructores).</w:t>
+        <w:t>Registro de consultas médicas: diagnóstico, tratamiento y observaciones (sobrecarga de constructores).</w:t>
       </w:r>
     </w:p>
     <w:p>
@@ -2932,7 +2882,7 @@
           <w:color w:val="2C3E50"/>
           <w:sz w:val="21"/>
         </w:rPr>
-        <w:t>Historial medico digital por mascota.</w:t>
+        <w:t>Historial médico digital por mascota.</w:t>
       </w:r>
     </w:p>
     <w:p>
@@ -2947,11 +2897,76 @@
         </w:rPr>
         <w:t>▸  Interfaz gráfica de usuario (GUI) con Java Swing: 7 pantallas (Login, Mascotas, Dueños, Veterinarios, Citas, Historial). JFrame, JTabbedPane, JTable, JPanel, ActionListener.</w:t>
       </w:r>
+    </w:p>
+    <w:p>
+      <w:pPr>
+        <w:spacing w:after="40"/>
+        <w:ind w:left="454"/>
+      </w:pPr>
+      <w:r>
+        <w:rPr>
+          <w:color w:val="1E8B4F"/>
+          <w:sz w:val="20"/>
+        </w:rPr>
+        <w:t>▸  Persistencia de datos en base de datos relacional MySQL 8.0 mediante JDBC (Driver Connector/J) y patrón DAO: 5 tablas, claves foráneas, utf8mb4.</w:t>
+      </w:r>
+    </w:p>
+    <w:p>
+      <w:pPr>
+        <w:shd w:val="clear" w:color="auto" w:fill="E8F8F0"/>
+      </w:pPr>
+      <w:r>
+        <w:rPr>
+          <w:b/>
+          <w:color w:val="145A32"/>
+        </w:rPr>
+        <w:t xml:space="preserve">  Funcionalidades NO incluidas</w:t>
+      </w:r>
+    </w:p>
+    <w:p>
+      <w:pPr>
+        <w:spacing w:after="40"/>
+        <w:ind w:left="454"/>
+      </w:pPr>
+      <w:r>
+        <w:rPr>
+          <w:color w:val="C0392B"/>
+          <w:sz w:val="20"/>
+        </w:rPr>
+        <w:t>✗  Módulo de facturación, reportes financieros e integración con POS.</w:t>
+      </w:r>
+    </w:p>
+    <w:p>
+      <w:pPr>
+        <w:spacing w:after="40"/>
+        <w:ind w:left="454"/>
+      </w:pPr>
+      <w:r>
+        <w:rPr>
+          <w:color w:val="C0392B"/>
+          <w:sz w:val="20"/>
+        </w:rPr>
+        <w:t>✗  Aplicación web o móvil (el sistema es de escritorio Java SE).</w:t>
+      </w:r>
+    </w:p>
+    <w:p>
+      <w:pPr>
+        <w:spacing w:after="40"/>
+        <w:ind w:left="454"/>
+      </w:pPr>
+      <w:r>
+        <w:rPr>
+          <w:color w:val="C0392B"/>
+          <w:sz w:val="20"/>
+        </w:rPr>
+        <w:t xml:space="preserve">✗  </w:t>
+      </w:r>
       <w:r>
         <w:rPr>
           <w:color w:val="2C3E50"/>
           <w:sz w:val="21"/>
         </w:rPr>
+        <w:t>Módulo de facturación, pagos o integración con POS.</w:t>
       </w:r>
     </w:p>
     <w:p>
@@ -2961,28 +2976,37 @@
       </w:pPr>
       <w:r>
         <w:rPr>
-          <w:color w:val="1E8B4F"/>
+          <w:color w:val="C0392B"/>
           <w:sz w:val="20"/>
         </w:rPr>
-        <w:t>▸  Persistencia de datos en base de datos relacional MySQL 8.0 mediante JDBC (Driver Connector/J) y patrón DAO: 5 tablas, claves foráneas, utf8mb4.</w:t>
+        <w:t xml:space="preserve">✗  </w:t>
       </w:r>
       <w:r>
         <w:rPr>
           <w:color w:val="2C3E50"/>
           <w:sz w:val="21"/>
         </w:rPr>
+        <w:t>Envío de recordatorios automáticos por correo electrónico o SMS.</w:t>
       </w:r>
     </w:p>
     <w:p>
       <w:pPr>
-        <w:shd w:val="clear" w:color="auto" w:fill="E8F8F0"/>
-      </w:pPr>
-      <w:r>
-        <w:rPr>
-          <w:b/>
-          <w:color w:val="145A32"/>
-        </w:rPr>
-        <w:t xml:space="preserve">  Funcionalidades NO incluidas</w:t>
+        <w:spacing w:after="40"/>
+        <w:ind w:left="454"/>
+      </w:pPr>
+      <w:r>
+        <w:rPr>
+          <w:color w:val="C0392B"/>
+          <w:sz w:val="20"/>
+        </w:rPr>
+        <w:t xml:space="preserve">✗  </w:t>
+      </w:r>
+      <w:r>
+        <w:rPr>
+          <w:color w:val="2C3E50"/>
+          <w:sz w:val="21"/>
+        </w:rPr>
+        <w:t>Aplicación web o móvil.</w:t>
       </w:r>
     </w:p>
     <w:p>
@@ -2995,13 +3019,14 @@
           <w:color w:val="C0392B"/>
           <w:sz w:val="20"/>
         </w:rPr>
-        <w:t>✗  Módulo de facturación, reportes financieros e integración con POS.</w:t>
+        <w:t xml:space="preserve">✗  </w:t>
       </w:r>
       <w:r>
         <w:rPr>
           <w:color w:val="2C3E50"/>
           <w:sz w:val="21"/>
         </w:rPr>
+        <w:t>Módulo de farmacia o control de medicamentos.</w:t>
       </w:r>
     </w:p>
     <w:p>
@@ -3014,113 +3039,14 @@
           <w:color w:val="C0392B"/>
           <w:sz w:val="20"/>
         </w:rPr>
-        <w:t>✗  Aplicación web o móvil (el sistema es de escritorio Java SE).</w:t>
+        <w:t xml:space="preserve">✗  </w:t>
       </w:r>
       <w:r>
         <w:rPr>
           <w:color w:val="2C3E50"/>
           <w:sz w:val="21"/>
         </w:rPr>
-      </w:r>
-    </w:p>
-    <w:p>
-      <w:pPr>
-        <w:spacing w:after="40"/>
-        <w:ind w:left="454"/>
-      </w:pPr>
-      <w:r>
-        <w:rPr>
-          <w:color w:val="C0392B"/>
-          <w:sz w:val="20"/>
-        </w:rPr>
-        <w:t xml:space="preserve">✗  </w:t>
-      </w:r>
-      <w:r>
-        <w:rPr>
-          <w:color w:val="2C3E50"/>
-          <w:sz w:val="21"/>
-        </w:rPr>
-        <w:t>Modulo de facturacion, pagos o integracion con POS.</w:t>
-      </w:r>
-    </w:p>
-    <w:p>
-      <w:pPr>
-        <w:spacing w:after="40"/>
-        <w:ind w:left="454"/>
-      </w:pPr>
-      <w:r>
-        <w:rPr>
-          <w:color w:val="C0392B"/>
-          <w:sz w:val="20"/>
-        </w:rPr>
-        <w:t xml:space="preserve">✗  </w:t>
-      </w:r>
-      <w:r>
-        <w:rPr>
-          <w:color w:val="2C3E50"/>
-          <w:sz w:val="21"/>
-        </w:rPr>
-        <w:t>Envio de recordatorios automaticos por correo electronico o SMS.</w:t>
-      </w:r>
-    </w:p>
-    <w:p>
-      <w:pPr>
-        <w:spacing w:after="40"/>
-        <w:ind w:left="454"/>
-      </w:pPr>
-      <w:r>
-        <w:rPr>
-          <w:color w:val="C0392B"/>
-          <w:sz w:val="20"/>
-        </w:rPr>
-        <w:t xml:space="preserve">✗  </w:t>
-      </w:r>
-      <w:r>
-        <w:rPr>
-          <w:color w:val="2C3E50"/>
-          <w:sz w:val="21"/>
-        </w:rPr>
-        <w:t>Aplicacion web o movil.</w:t>
-      </w:r>
-    </w:p>
-    <w:p>
-      <w:pPr>
-        <w:spacing w:after="40"/>
-        <w:ind w:left="454"/>
-      </w:pPr>
-      <w:r>
-        <w:rPr>
-          <w:color w:val="C0392B"/>
-          <w:sz w:val="20"/>
-        </w:rPr>
-        <w:t xml:space="preserve">✗  </w:t>
-      </w:r>
-      <w:r>
-        <w:rPr>
-          <w:color w:val="2C3E50"/>
-          <w:sz w:val="21"/>
-        </w:rPr>
-        <w:t>Modulo de farmacia o control de medicamentos.</w:t>
-      </w:r>
-    </w:p>
-    <w:p>
-      <w:pPr>
-        <w:spacing w:after="40"/>
-        <w:ind w:left="454"/>
-      </w:pPr>
-      <w:r>
-        <w:rPr>
-          <w:color w:val="C0392B"/>
-          <w:sz w:val="20"/>
-        </w:rPr>
-        <w:t xml:space="preserve">✗  </w:t>
-      </w:r>
-      <w:r>
-        <w:rPr>
-          <w:color w:val="2C3E50"/>
-          <w:sz w:val="21"/>
-        </w:rPr>
-        <w:t>Integracion con sistemas externos de identificacion de mascotas.</w:t>
+        <w:t>Integración con sistemas externos de identificación de mascotas.</w:t>
       </w:r>
     </w:p>
     <w:p>
@@ -3160,7 +3086,19 @@
         <w:rPr>
           <w:color w:val="2C3E50"/>
         </w:rPr>
-        <w:t>A continuacion se presentan los 40 requerimientos funcionales de VetCare, organizados en 6 modulos tematicos.</w:t>
+        <w:t xml:space="preserve">A </w:t>
+      </w:r>
+      <w:r>
+        <w:rPr>
+          <w:color w:val="2C3E50"/>
+        </w:rPr>
+        <w:t>continuación,</w:t>
+      </w:r>
+      <w:r>
+        <w:rPr>
+          <w:color w:val="2C3E50"/>
+        </w:rPr>
+        <w:t xml:space="preserve"> se presentan los 40 requerimientos funcionales de VetCare, organizados en 6 módulos temáticos.</w:t>
       </w:r>
     </w:p>
     <w:p>
@@ -3174,7 +3112,7 @@
           <w:color w:val="FFFFFF"/>
           <w:sz w:val="21"/>
         </w:rPr>
-        <w:t xml:space="preserve">  MODULO 1 - Autenticacion y Usuarios</w:t>
+        <w:t xml:space="preserve">  MÓDULO 1 - Autenticación y Usuarios</w:t>
       </w:r>
     </w:p>
     <w:tbl>
@@ -3243,7 +3181,7 @@
                 <w:color w:val="FFFFFF"/>
                 <w:sz w:val="19"/>
               </w:rPr>
-              <w:t>Descripcion</w:t>
+              <w:t>Descripción</w:t>
             </w:r>
           </w:p>
         </w:tc>
@@ -3294,7 +3232,7 @@
                 <w:color w:val="2C3E50"/>
                 <w:sz w:val="18"/>
               </w:rPr>
-              <w:t>Iniciar sesion</w:t>
+              <w:t>Iniciar sesión</w:t>
             </w:r>
           </w:p>
         </w:tc>
@@ -3309,7 +3247,7 @@
                 <w:color w:val="2C3E50"/>
                 <w:sz w:val="18"/>
               </w:rPr>
-              <w:t>El sistema permite autenticar al usuario con nombre de usuario y contrasena.</w:t>
+              <w:t>El sistema permite autenticar al usuario con nombre de usuario y contraseña.</w:t>
             </w:r>
           </w:p>
         </w:tc>
@@ -3360,7 +3298,7 @@
                 <w:color w:val="2C3E50"/>
                 <w:sz w:val="18"/>
               </w:rPr>
-              <w:t>Cerrar sesion</w:t>
+              <w:t>Cerrar sesión</w:t>
             </w:r>
           </w:p>
         </w:tc>
@@ -3375,7 +3313,21 @@
                 <w:color w:val="2C3E50"/>
                 <w:sz w:val="18"/>
               </w:rPr>
-              <w:t>El sistema cierra la sesion activa y regresa al menu de autenticacion.</w:t>
+              <w:t xml:space="preserve">El sistema cierra la sesión activa y regresa al </w:t>
+            </w:r>
+            <w:r>
+              <w:rPr>
+                <w:color w:val="2C3E50"/>
+                <w:sz w:val="18"/>
+              </w:rPr>
+              <w:t>menú</w:t>
+            </w:r>
+            <w:r>
+              <w:rPr>
+                <w:color w:val="2C3E50"/>
+                <w:sz w:val="18"/>
+              </w:rPr>
+              <w:t xml:space="preserve"> de autenticación.</w:t>
             </w:r>
           </w:p>
         </w:tc>
@@ -3426,7 +3378,7 @@
                 <w:color w:val="2C3E50"/>
                 <w:sz w:val="18"/>
               </w:rPr>
-              <w:t>Cambiar contrasena</w:t>
+              <w:t>Cambiar contraseña</w:t>
             </w:r>
           </w:p>
         </w:tc>
@@ -3441,7 +3393,7 @@
                 <w:color w:val="2C3E50"/>
                 <w:sz w:val="18"/>
               </w:rPr>
-              <w:t>El sistema permite modificar la contrasena ingresando la clave antigua y la nueva.</w:t>
+              <w:t>El sistema permite modificar la contraseña ingresando la clave antigua y la nueva.</w:t>
             </w:r>
           </w:p>
         </w:tc>
@@ -3546,7 +3498,7 @@
           <w:color w:val="FFFFFF"/>
           <w:sz w:val="21"/>
         </w:rPr>
-        <w:t xml:space="preserve">  MODULO 2 - Gestion de Mascotas</w:t>
+        <w:t xml:space="preserve">  MÓDULO 2 - Gestión de Mascotas</w:t>
       </w:r>
     </w:p>
     <w:tbl>
@@ -3615,7 +3567,7 @@
                 <w:color w:val="FFFFFF"/>
                 <w:sz w:val="19"/>
               </w:rPr>
-              <w:t>Descripcion</w:t>
+              <w:t>Descripción</w:t>
             </w:r>
           </w:p>
         </w:tc>
@@ -3681,7 +3633,7 @@
                 <w:color w:val="2C3E50"/>
                 <w:sz w:val="18"/>
               </w:rPr>
-              <w:t>El sistema registra una mascota con nombre, especie, raza, edad, sexo, peso y dueno.</w:t>
+              <w:t>El sistema registra una mascota con nombre, especie, raza, edad, sexo, peso y dueño.</w:t>
             </w:r>
           </w:p>
         </w:tc>
@@ -3813,7 +3765,7 @@
                 <w:color w:val="2C3E50"/>
                 <w:sz w:val="18"/>
               </w:rPr>
-              <w:t>El sistema da de baja a una mascota previa confirmacion del usuario.</w:t>
+              <w:t>El sistema da de baja a una mascota previa confirmación del usuario.</w:t>
             </w:r>
           </w:p>
         </w:tc>
@@ -3878,7 +3830,7 @@
                 <w:color w:val="2C3E50"/>
                 <w:sz w:val="18"/>
               </w:rPr>
-              <w:t>El sistema busca mascotas ingresando el nombre o parte de el.</w:t>
+              <w:t>El sistema busca mascotas ingresando el nombre o parte de él.</w:t>
             </w:r>
           </w:p>
         </w:tc>
@@ -3929,7 +3881,7 @@
                 <w:color w:val="2C3E50"/>
                 <w:sz w:val="18"/>
               </w:rPr>
-              <w:t>Buscar por dueno</w:t>
+              <w:t>Buscar por dueño</w:t>
             </w:r>
           </w:p>
         </w:tc>
@@ -3944,7 +3896,7 @@
                 <w:color w:val="2C3E50"/>
                 <w:sz w:val="18"/>
               </w:rPr>
-              <w:t>El sistema filtra mascotas por nombre o DNI del dueno.</w:t>
+              <w:t>El sistema filtra mascotas por nombre o DNI del dueño.</w:t>
             </w:r>
           </w:p>
         </w:tc>
@@ -4010,7 +3962,7 @@
                 <w:color w:val="2C3E50"/>
                 <w:sz w:val="18"/>
               </w:rPr>
-              <w:t>El sistema muestra el listado completo de mascotas con datos basicos.</w:t>
+              <w:t>El sistema muestra el listado completo de mascotas con datos básicos.</w:t>
             </w:r>
           </w:p>
         </w:tc>
@@ -4207,7 +4159,7 @@
                 <w:color w:val="2C3E50"/>
                 <w:sz w:val="18"/>
               </w:rPr>
-              <w:t>El sistema permite ingresar la raza especifica segun la especie.</w:t>
+              <w:t>El sistema permite ingresar la raza específica según la especie.</w:t>
             </w:r>
           </w:p>
         </w:tc>
@@ -4378,7 +4330,7 @@
           <w:color w:val="FFFFFF"/>
           <w:sz w:val="21"/>
         </w:rPr>
-        <w:t xml:space="preserve">  MODULO 3 - Gestion de Duenos</w:t>
+        <w:t xml:space="preserve">  MÓDULO 3 - Gestión de Dueños</w:t>
       </w:r>
     </w:p>
     <w:tbl>
@@ -4447,7 +4399,7 @@
                 <w:color w:val="FFFFFF"/>
                 <w:sz w:val="19"/>
               </w:rPr>
-              <w:t>Descripcion</w:t>
+              <w:t>Descripción</w:t>
             </w:r>
           </w:p>
         </w:tc>
@@ -4498,7 +4450,7 @@
                 <w:color w:val="2C3E50"/>
                 <w:sz w:val="18"/>
               </w:rPr>
-              <w:t>Registrar dueno</w:t>
+              <w:t>Registrar dueño</w:t>
             </w:r>
           </w:p>
         </w:tc>
@@ -4513,7 +4465,21 @@
                 <w:color w:val="2C3E50"/>
                 <w:sz w:val="18"/>
               </w:rPr>
-              <w:t>El sistema registra un dueno con nombre, DNI, direccion, telefono y correo.</w:t>
+              <w:t xml:space="preserve">El sistema registra un dueño con nombre, DNI, dirección, </w:t>
+            </w:r>
+            <w:r>
+              <w:rPr>
+                <w:color w:val="2C3E50"/>
+                <w:sz w:val="18"/>
+              </w:rPr>
+              <w:t>teléfono</w:t>
+            </w:r>
+            <w:r>
+              <w:rPr>
+                <w:color w:val="2C3E50"/>
+                <w:sz w:val="18"/>
+              </w:rPr>
+              <w:t xml:space="preserve"> y correo.</w:t>
             </w:r>
           </w:p>
         </w:tc>
@@ -4564,7 +4530,7 @@
                 <w:color w:val="2C3E50"/>
                 <w:sz w:val="18"/>
               </w:rPr>
-              <w:t>Modificar dueno</w:t>
+              <w:t>Modificar dueño</w:t>
             </w:r>
           </w:p>
         </w:tc>
@@ -4579,7 +4545,7 @@
                 <w:color w:val="2C3E50"/>
                 <w:sz w:val="18"/>
               </w:rPr>
-              <w:t>El sistema permite actualizar la informacion de un dueno existente.</w:t>
+              <w:t>El sistema permite actualizar la información de un dueño existente.</w:t>
             </w:r>
           </w:p>
         </w:tc>
@@ -4630,7 +4596,7 @@
                 <w:color w:val="2C3E50"/>
                 <w:sz w:val="18"/>
               </w:rPr>
-              <w:t>Eliminar dueno</w:t>
+              <w:t>Eliminar dueño</w:t>
             </w:r>
           </w:p>
         </w:tc>
@@ -4645,7 +4611,7 @@
                 <w:color w:val="2C3E50"/>
                 <w:sz w:val="18"/>
               </w:rPr>
-              <w:t>El sistema elimina un dueno sin mascotas activas, previa confirmacion.</w:t>
+              <w:t>El sistema elimina un dueño sin mascotas activas, previa confirmación.</w:t>
             </w:r>
           </w:p>
         </w:tc>
@@ -4710,7 +4676,7 @@
                 <w:color w:val="2C3E50"/>
                 <w:sz w:val="18"/>
               </w:rPr>
-              <w:t>El sistema busca duenos ingresando nombre o parte de el.</w:t>
+              <w:t>El sistema busca dueños ingresando nombre o parte de él.</w:t>
             </w:r>
           </w:p>
         </w:tc>
@@ -4776,7 +4742,7 @@
                 <w:color w:val="2C3E50"/>
                 <w:sz w:val="18"/>
               </w:rPr>
-              <w:t>El sistema busca un dueno por su numero de DNI.</w:t>
+              <w:t>El sistema busca un dueño por su número de DNI.</w:t>
             </w:r>
           </w:p>
         </w:tc>
@@ -4827,7 +4793,7 @@
                 <w:color w:val="2C3E50"/>
                 <w:sz w:val="18"/>
               </w:rPr>
-              <w:t>Listar duenos</w:t>
+              <w:t>Listar dueños</w:t>
             </w:r>
           </w:p>
         </w:tc>
@@ -4842,7 +4808,7 @@
                 <w:color w:val="2C3E50"/>
                 <w:sz w:val="18"/>
               </w:rPr>
-              <w:t>El sistema muestra la lista completa de duenos registrados.</w:t>
+              <w:t>El sistema muestra la lista completa de dueños registrados.</w:t>
             </w:r>
           </w:p>
         </w:tc>
@@ -4892,7 +4858,7 @@
                 <w:color w:val="2C3E50"/>
                 <w:sz w:val="18"/>
               </w:rPr>
-              <w:t>Ver mascotas del dueno</w:t>
+              <w:t>Ver mascotas del dueño</w:t>
             </w:r>
           </w:p>
         </w:tc>
@@ -4907,7 +4873,7 @@
                 <w:color w:val="2C3E50"/>
                 <w:sz w:val="18"/>
               </w:rPr>
-              <w:t>El sistema muestra todas las mascotas vinculadas a un dueno especifico.</w:t>
+              <w:t>El sistema muestra todas las mascotas vinculadas a un dueño específico.</w:t>
             </w:r>
           </w:p>
         </w:tc>
@@ -4948,7 +4914,7 @@
           <w:color w:val="FFFFFF"/>
           <w:sz w:val="21"/>
         </w:rPr>
-        <w:t xml:space="preserve">  MODULO 4 - Gestion de Citas</w:t>
+        <w:t xml:space="preserve">  MÓDULO 4 - Gestión de Citas</w:t>
       </w:r>
     </w:p>
     <w:tbl>
@@ -5017,7 +4983,7 @@
                 <w:color w:val="FFFFFF"/>
                 <w:sz w:val="19"/>
               </w:rPr>
-              <w:t>Descripcion</w:t>
+              <w:t>Descripción</w:t>
             </w:r>
           </w:p>
         </w:tc>
@@ -5265,7 +5231,7 @@
                 <w:color w:val="2C3E50"/>
                 <w:sz w:val="18"/>
               </w:rPr>
-              <w:t>Citas del dia</w:t>
+              <w:t>Citas del día</w:t>
             </w:r>
           </w:p>
         </w:tc>
@@ -5346,7 +5312,7 @@
                 <w:color w:val="2C3E50"/>
                 <w:sz w:val="18"/>
               </w:rPr>
-              <w:t>El sistema muestra el historial de citas de una mascota especifica.</w:t>
+              <w:t>El sistema muestra el historial de citas de una mascota específica.</w:t>
             </w:r>
           </w:p>
         </w:tc>
@@ -5412,7 +5378,7 @@
                 <w:color w:val="2C3E50"/>
                 <w:sz w:val="18"/>
               </w:rPr>
-              <w:t>El sistema consulta citas en una fecha especifica.</w:t>
+              <w:t>El sistema consulta citas en una fecha específica.</w:t>
             </w:r>
           </w:p>
         </w:tc>
@@ -5477,7 +5443,7 @@
                 <w:color w:val="2C3E50"/>
                 <w:sz w:val="18"/>
               </w:rPr>
-              <w:t>El sistema muestra todas las citas aun no atendidas.</w:t>
+              <w:t>El sistema muestra todas las citas aún no atendidas.</w:t>
             </w:r>
           </w:p>
         </w:tc>
@@ -5543,7 +5509,7 @@
                 <w:color w:val="2C3E50"/>
                 <w:sz w:val="18"/>
               </w:rPr>
-              <w:t>El sistema marca una cita como 'Atendida' o 'No asistio'.</w:t>
+              <w:t>El sistema marca una cita como 'Atendida' o 'No asistió'.</w:t>
             </w:r>
           </w:p>
         </w:tc>
@@ -5650,7 +5616,7 @@
           <w:color w:val="FFFFFF"/>
           <w:sz w:val="21"/>
         </w:rPr>
-        <w:t xml:space="preserve">  MODULO 5 - Gestion de Veterinarios</w:t>
+        <w:t xml:space="preserve">  MÓDULO 5 - Gestión de Veterinarios</w:t>
       </w:r>
     </w:p>
     <w:tbl>
@@ -5719,7 +5685,7 @@
                 <w:color w:val="FFFFFF"/>
                 <w:sz w:val="19"/>
               </w:rPr>
-              <w:t>Descripcion</w:t>
+              <w:t>Descripción</w:t>
             </w:r>
           </w:p>
         </w:tc>
@@ -5851,7 +5817,7 @@
                 <w:color w:val="2C3E50"/>
                 <w:sz w:val="18"/>
               </w:rPr>
-              <w:t>El sistema actualiza la informacion de un veterinario registrado.</w:t>
+              <w:t>El sistema actualiza la información de un veterinario registrado.</w:t>
             </w:r>
           </w:p>
         </w:tc>
@@ -6047,7 +6013,7 @@
                 <w:color w:val="2C3E50"/>
                 <w:sz w:val="18"/>
               </w:rPr>
-              <w:t>El sistema muestra todas las citas asignadas a un veterinario especifico.</w:t>
+              <w:t>El sistema muestra todas las citas asignadas a un veterinario específico.</w:t>
             </w:r>
           </w:p>
         </w:tc>
@@ -6088,7 +6054,7 @@
           <w:color w:val="FFFFFF"/>
           <w:sz w:val="21"/>
         </w:rPr>
-        <w:t xml:space="preserve">  MODULO 6 - Historial Medico y Reportes</w:t>
+        <w:t xml:space="preserve">  MÓDULO 6 - Historial Médico y Reportes</w:t>
       </w:r>
     </w:p>
     <w:tbl>
@@ -6157,7 +6123,7 @@
                 <w:color w:val="FFFFFF"/>
                 <w:sz w:val="19"/>
               </w:rPr>
-              <w:t>Descripcion</w:t>
+              <w:t>Descripción</w:t>
             </w:r>
           </w:p>
         </w:tc>
@@ -6223,7 +6189,7 @@
                 <w:color w:val="2C3E50"/>
                 <w:sz w:val="18"/>
               </w:rPr>
-              <w:t>El sistema guarda el resultado de una cita: diagnostico, observaciones y tratamiento.</w:t>
+              <w:t>El sistema guarda el resultado de una cita: diagnóstico, observaciones y tratamiento.</w:t>
             </w:r>
           </w:p>
         </w:tc>
@@ -6355,7 +6321,7 @@
                 <w:color w:val="2C3E50"/>
                 <w:sz w:val="18"/>
               </w:rPr>
-              <w:t>El sistema muestra el historial medico completo de una mascota seleccionada.</w:t>
+              <w:t>El sistema muestra el historial médico completo de una mascota seleccionada.</w:t>
             </w:r>
           </w:p>
         </w:tc>
@@ -6487,7 +6453,7 @@
         <w:rPr>
           <w:color w:val="2C3E50"/>
         </w:rPr>
-        <w:t>Las historias de usuario describen las funcionalidades del sistema desde la perspectiva del usuario, siguiendo el formato: Como [rol], quiero [accion] para [beneficio].</w:t>
+        <w:t>Las historias de usuario describen las funcionalidades del sistema desde la perspectiva del usuario, siguiendo el formato: Como [rol], quiero [acción] para [beneficio].</w:t>
       </w:r>
     </w:p>
     <w:p/>
@@ -6509,7 +6475,7 @@
           <w:color w:val="FFFFFF"/>
           <w:sz w:val="21"/>
         </w:rPr>
-        <w:t>Iniciar sesion en el sistema</w:t>
+        <w:t>Iniciar sesión en el sistema</w:t>
       </w:r>
     </w:p>
     <w:tbl>
@@ -6583,7 +6549,7 @@
                 <w:color w:val="2C3E50"/>
                 <w:sz w:val="19"/>
               </w:rPr>
-              <w:t>ingresar con mi usuario y contrasena al sistema VetCare</w:t>
+              <w:t>ingresar con mi usuario y contraseña al sistema VetCare</w:t>
             </w:r>
           </w:p>
         </w:tc>
@@ -6616,7 +6582,7 @@
                 <w:color w:val="2C3E50"/>
                 <w:sz w:val="19"/>
               </w:rPr>
-              <w:t>acceder a las funciones segun mi rol asignado</w:t>
+              <w:t>acceder a las funciones según mi rol asignado</w:t>
             </w:r>
           </w:p>
         </w:tc>
@@ -6682,7 +6648,21 @@
                 <w:color w:val="2C3E50"/>
                 <w:sz w:val="19"/>
               </w:rPr>
-              <w:t>El sistema muestra el menu principal al validar las credenciales correctas.</w:t>
+              <w:t xml:space="preserve">El sistema muestra el </w:t>
+            </w:r>
+            <w:r>
+              <w:rPr>
+                <w:color w:val="2C3E50"/>
+                <w:sz w:val="19"/>
+              </w:rPr>
+              <w:t>menú</w:t>
+            </w:r>
+            <w:r>
+              <w:rPr>
+                <w:color w:val="2C3E50"/>
+                <w:sz w:val="19"/>
+              </w:rPr>
+              <w:t xml:space="preserve"> principal al validar las credenciales correctas.</w:t>
             </w:r>
           </w:p>
         </w:tc>
@@ -6714,7 +6694,7 @@
               <w:rPr>
                 <w:sz w:val="19"/>
               </w:rPr>
-              <w:t>Si las credenciales son incorrectas, muestra: 'Usuario o contrasena invalidos. Intente de nuevo.' Tras 3 intentos fallidos, bloquea el acceso.</w:t>
+              <w:t>Si las credenciales son incorrectas, muestra: 'Usuario o contraseña inválidos. Intente de nuevo.' Tras 3 intentos fallidos, bloquea el acceso.</w:t>
             </w:r>
           </w:p>
         </w:tc>
@@ -6743,7 +6723,7 @@
           <w:color w:val="FFFFFF"/>
           <w:sz w:val="21"/>
         </w:rPr>
-        <w:t>Registrar una cita medica</w:t>
+        <w:t>Registrar una cita médica</w:t>
       </w:r>
     </w:p>
     <w:tbl>
@@ -6850,7 +6830,7 @@
                 <w:color w:val="2C3E50"/>
                 <w:sz w:val="19"/>
               </w:rPr>
-              <w:t>organizar la agenda de la clinica y evitar cruces de horario</w:t>
+              <w:t>organizar la agenda de la clínica y evitar cruces de horario</w:t>
             </w:r>
           </w:p>
         </w:tc>
@@ -6916,7 +6896,7 @@
                 <w:color w:val="2C3E50"/>
                 <w:sz w:val="19"/>
               </w:rPr>
-              <w:t>La cita se registra y aparece en el listado del dia correspondiente.</w:t>
+              <w:t>La cita se registra y aparece en el listado del día correspondiente.</w:t>
             </w:r>
           </w:p>
         </w:tc>
@@ -6977,7 +6957,7 @@
           <w:color w:val="FFFFFF"/>
           <w:sz w:val="21"/>
         </w:rPr>
-        <w:t>Ver historial medico de una mascota</w:t>
+        <w:t>Ver historial médico de una mascota</w:t>
       </w:r>
     </w:p>
     <w:tbl>
@@ -7051,7 +7031,7 @@
                 <w:color w:val="2C3E50"/>
                 <w:sz w:val="19"/>
               </w:rPr>
-              <w:t>acceder al historial medico completo de una mascota</w:t>
+              <w:t>acceder al historial médico completo de una mascota</w:t>
             </w:r>
           </w:p>
         </w:tc>
@@ -7084,7 +7064,7 @@
                 <w:color w:val="2C3E50"/>
                 <w:sz w:val="19"/>
               </w:rPr>
-              <w:t>revisar diagnosticos y tratamientos anteriores antes de atenderla</w:t>
+              <w:t>revisar diagnósticos y tratamientos anteriores antes de atenderla</w:t>
             </w:r>
           </w:p>
         </w:tc>
@@ -7150,7 +7130,7 @@
                 <w:color w:val="2C3E50"/>
                 <w:sz w:val="19"/>
               </w:rPr>
-              <w:t>El sistema muestra todas las consultas previas con fecha, diagnostico y tratamiento.</w:t>
+              <w:t>El sistema muestra todas las consultas previas con fecha, diagnóstico y tratamiento.</w:t>
             </w:r>
           </w:p>
         </w:tc>
@@ -7182,7 +7162,7 @@
               <w:rPr>
                 <w:sz w:val="19"/>
               </w:rPr>
-              <w:t>Si no hay historial: muestra 'Sin consultas medicas registradas para esta mascota.'</w:t>
+              <w:t>Si no hay historial: muestra 'Sin consultas médicas registradas para esta mascota.'</w:t>
             </w:r>
           </w:p>
         </w:tc>
@@ -7285,7 +7265,7 @@
                 <w:color w:val="2C3E50"/>
                 <w:sz w:val="19"/>
               </w:rPr>
-              <w:t>registrar el diagnostico y tratamiento de una consulta</w:t>
+              <w:t>registrar el diagnóstico y tratamiento de una consulta</w:t>
             </w:r>
           </w:p>
         </w:tc>
@@ -7318,7 +7298,7 @@
                 <w:color w:val="2C3E50"/>
                 <w:sz w:val="19"/>
               </w:rPr>
-              <w:t>mantener el historial medico actualizado de la mascota</w:t>
+              <w:t>mantener el historial médico actualizado de la mascota</w:t>
             </w:r>
           </w:p>
         </w:tc>
@@ -7416,7 +7396,7 @@
               <w:rPr>
                 <w:sz w:val="19"/>
               </w:rPr>
-              <w:t>Si no se ingresa diagnostico, el sistema solicita el campo antes de guardar.</w:t>
+              <w:t>Si no se ingresa diagnóstico, el sistema solicita el campo antes de guardar.</w:t>
             </w:r>
           </w:p>
         </w:tc>
@@ -7445,7 +7425,7 @@
           <w:color w:val="FFFFFF"/>
           <w:sz w:val="21"/>
         </w:rPr>
-        <w:t>Ver citas del dia</w:t>
+        <w:t>Ver citas del día</w:t>
       </w:r>
     </w:p>
     <w:tbl>
@@ -7553,7 +7533,7 @@
                 <w:color w:val="2C3E50"/>
                 <w:sz w:val="19"/>
               </w:rPr>
-              <w:t>organizar la atencion y preparar los expedientes del dia</w:t>
+              <w:t>organizar la atención y preparar los expedientes del día</w:t>
             </w:r>
           </w:p>
         </w:tc>
@@ -7619,7 +7599,7 @@
                 <w:color w:val="2C3E50"/>
                 <w:sz w:val="19"/>
               </w:rPr>
-              <w:t>Lista todas las citas con hora, mascota, dueno y veterinario asignado.</w:t>
+              <w:t>Lista todas las citas con hora, mascota, dueño y veterinario asignado.</w:t>
             </w:r>
           </w:p>
         </w:tc>
@@ -7853,7 +7833,7 @@
                 <w:color w:val="2C3E50"/>
                 <w:sz w:val="19"/>
               </w:rPr>
-              <w:t>La mascota se registra vinculada al dueno correspondiente.</w:t>
+              <w:t>La mascota se registra vinculada al dueño correspondiente.</w:t>
             </w:r>
           </w:p>
         </w:tc>
@@ -7885,7 +7865,7 @@
               <w:rPr>
                 <w:sz w:val="19"/>
               </w:rPr>
-              <w:t>Si no se ingresa especie valida, el sistema muestra 'Especie no valida' y no guarda el registro.</w:t>
+              <w:t>Si no se ingresa especie válida, el sistema muestra 'Especie no válida' y no guarda el registro.</w:t>
             </w:r>
           </w:p>
         </w:tc>
@@ -7914,7 +7894,7 @@
           <w:color w:val="FFFFFF"/>
           <w:sz w:val="21"/>
         </w:rPr>
-        <w:t>Buscar dueno por DNI</w:t>
+        <w:t>Buscar dueño por DNI</w:t>
       </w:r>
     </w:p>
     <w:tbl>
@@ -7988,7 +7968,7 @@
                 <w:color w:val="2C3E50"/>
                 <w:sz w:val="19"/>
               </w:rPr>
-              <w:t>buscar un dueno ingresando su numero de DNI</w:t>
+              <w:t>buscar un dueño ingresando su número de DNI</w:t>
             </w:r>
           </w:p>
         </w:tc>
@@ -8021,7 +8001,7 @@
                 <w:color w:val="2C3E50"/>
                 <w:sz w:val="19"/>
               </w:rPr>
-              <w:t>verificar si ya esta registrado y ver sus mascotas asociadas</w:t>
+              <w:t>verificar si ya está registrado y ver sus mascotas asociadas</w:t>
             </w:r>
           </w:p>
         </w:tc>
@@ -8087,7 +8067,7 @@
                 <w:color w:val="2C3E50"/>
                 <w:sz w:val="19"/>
               </w:rPr>
-              <w:t>El sistema muestra los datos del dueno y el listado de sus mascotas.</w:t>
+              <w:t>El sistema muestra los datos del dueño y el listado de sus mascotas.</w:t>
             </w:r>
           </w:p>
         </w:tc>
@@ -8119,7 +8099,19 @@
               <w:rPr>
                 <w:sz w:val="19"/>
               </w:rPr>
-              <w:t>Si el DNI no existe: 'Dueno no encontrado. Desea registrarlo?'</w:t>
+              <w:t xml:space="preserve">Si el DNI no existe: 'Dueño no encontrado. </w:t>
+            </w:r>
+            <w:r>
+              <w:rPr>
+                <w:sz w:val="19"/>
+              </w:rPr>
+              <w:t>¿Desea registrarlo?</w:t>
+            </w:r>
+            <w:r>
+              <w:rPr>
+                <w:sz w:val="19"/>
+              </w:rPr>
+              <w:t>'</w:t>
             </w:r>
           </w:p>
         </w:tc>
@@ -8255,7 +8247,7 @@
                 <w:color w:val="2C3E50"/>
                 <w:sz w:val="19"/>
               </w:rPr>
-              <w:t>liberar el horario del veterinario cuando el dueno avisa que no asistira</w:t>
+              <w:t>liberar el horario del veterinario cuando el dueño avisa que no asistirá</w:t>
             </w:r>
           </w:p>
         </w:tc>
@@ -8456,7 +8448,7 @@
                 <w:color w:val="2C3E50"/>
                 <w:sz w:val="19"/>
               </w:rPr>
-              <w:t>ver la agenda completa de un veterinario especifico</w:t>
+              <w:t>ver la agenda completa de un veterinario específico</w:t>
             </w:r>
           </w:p>
         </w:tc>
@@ -8489,7 +8481,7 @@
                 <w:color w:val="2C3E50"/>
                 <w:sz w:val="19"/>
               </w:rPr>
-              <w:t>distribuir la carga de trabajo equitativamente entre el equipo medico</w:t>
+              <w:t>distribuir la carga de trabajo equitativamente entre el equipo médico</w:t>
             </w:r>
           </w:p>
         </w:tc>
@@ -8690,7 +8682,7 @@
                 <w:color w:val="2C3E50"/>
                 <w:sz w:val="19"/>
               </w:rPr>
-              <w:t>marcar si el paciente asistio o no a la cita programada</w:t>
+              <w:t>marcar si el paciente asistió o no a la cita programada</w:t>
             </w:r>
           </w:p>
         </w:tc>
@@ -8723,7 +8715,7 @@
                 <w:color w:val="2C3E50"/>
                 <w:sz w:val="19"/>
               </w:rPr>
-              <w:t>mantener actualizado el estado de las citas y el historial de atencion</w:t>
+              <w:t>mantener actualizado el estado de las citas y el historial de atención</w:t>
             </w:r>
           </w:p>
         </w:tc>
@@ -8790,7 +8782,7 @@
                 <w:color w:val="2C3E50"/>
                 <w:sz w:val="19"/>
               </w:rPr>
-              <w:t>La cita se actualiza a 'Atendida' o 'No asistio' segun la respuesta del recepcionista.</w:t>
+              <w:t>La cita se actualiza a 'Atendida' o 'No asistió' según la respuesta del recepcionista.</w:t>
             </w:r>
           </w:p>
         </w:tc>
@@ -8881,11 +8873,11 @@
         <w:tblLook w:val="04A0" w:firstRow="1" w:lastRow="0" w:firstColumn="1" w:lastColumn="0" w:noHBand="0" w:noVBand="1"/>
       </w:tblPr>
       <w:tblGrid>
-        <w:gridCol w:w="1593"/>
-        <w:gridCol w:w="844"/>
-        <w:gridCol w:w="2583"/>
-        <w:gridCol w:w="2839"/>
-        <w:gridCol w:w="1763"/>
+        <w:gridCol w:w="1341"/>
+        <w:gridCol w:w="866"/>
+        <w:gridCol w:w="2666"/>
+        <w:gridCol w:w="2932"/>
+        <w:gridCol w:w="1817"/>
       </w:tblGrid>
       <w:tr>
         <w:tc>
@@ -8960,7 +8952,7 @@
                 <w:color w:val="FFFFFF"/>
                 <w:sz w:val="18"/>
               </w:rPr>
-              <w:t>Metodos</w:t>
+              <w:t>Métodos</w:t>
             </w:r>
           </w:p>
         </w:tc>
@@ -8979,7 +8971,7 @@
                 <w:color w:val="FFFFFF"/>
                 <w:sz w:val="18"/>
               </w:rPr>
-              <w:t>Relacion</w:t>
+              <w:t>Relación</w:t>
             </w:r>
           </w:p>
         </w:tc>
@@ -9787,7 +9779,7 @@
                 <w:color w:val="2C3E50"/>
                 <w:sz w:val="17"/>
               </w:rPr>
-              <w:t>Composicion: Animal(1), ConsultaMedica(0..*)</w:t>
+              <w:t>Composición: Animal(1), ConsultaMedica(0..*)</w:t>
             </w:r>
           </w:p>
         </w:tc>
@@ -9921,7 +9913,7 @@
                 <w:color w:val="2C3E50"/>
                 <w:sz w:val="17"/>
               </w:rPr>
-              <w:t>Asociacion: Mascota y Veterinario</w:t>
+              <w:t>Asociación: Mascota y Veterinario</w:t>
             </w:r>
           </w:p>
         </w:tc>
@@ -10664,7 +10656,7 @@
           <w:color w:val="2C3E50"/>
           <w:sz w:val="21"/>
         </w:rPr>
-        <w:t>Composicion:  Mascota contiene Animal (1..1) y ConsultaMedica (0..*)</w:t>
+        <w:t>Composición:  Mascota contiene Animal (1..1) y ConsultaMedica (0..*)</w:t>
       </w:r>
     </w:p>
     <w:p>
@@ -10684,7 +10676,7 @@
           <w:color w:val="2C3E50"/>
           <w:sz w:val="21"/>
         </w:rPr>
-        <w:t>Composicion:  GestorMascotas contiene Mascota (0..*)</w:t>
+        <w:t>Composición:  GestorMascotas contiene Mascota (0..*)</w:t>
       </w:r>
     </w:p>
     <w:p>
@@ -10704,7 +10696,7 @@
           <w:color w:val="2C3E50"/>
           <w:sz w:val="21"/>
         </w:rPr>
-        <w:t>Composicion:  GestorCitas contiene Cita (0..*)</w:t>
+        <w:t>Composición:  GestorCitas contiene Cita (0..*)</w:t>
       </w:r>
     </w:p>
     <w:p>
@@ -10724,7 +10716,7 @@
           <w:color w:val="2C3E50"/>
           <w:sz w:val="21"/>
         </w:rPr>
-        <w:t>Asociacion:   Mascota -&gt; Dueno (el dueno posee la mascota)</w:t>
+        <w:t>Asociación:   Mascota -&gt; Dueno (el dueño posee la mascota)</w:t>
       </w:r>
     </w:p>
     <w:p>
@@ -10744,7 +10736,7 @@
           <w:color w:val="2C3E50"/>
           <w:sz w:val="21"/>
         </w:rPr>
-        <w:t>Asociacion:   Cita -&gt; Mascota  |  Cita -&gt; Veterinario</w:t>
+        <w:t>Asociación:   Cita -&gt; Mascota  |  Cita -&gt; Veterinario</w:t>
       </w:r>
     </w:p>
     <w:p>
@@ -10784,7 +10776,21 @@
           <w:color w:val="2C3E50"/>
           <w:sz w:val="21"/>
         </w:rPr>
-        <w:t>Sobrecarga:   ConsultaMedica tiene 3 constructores (1, 2 y 3 parametros)</w:t>
+        <w:t xml:space="preserve">Sobrecarga:   ConsultaMedica tiene 3 constructores (1, 2 y 3 </w:t>
+      </w:r>
+      <w:r>
+        <w:rPr>
+          <w:color w:val="2C3E50"/>
+          <w:sz w:val="21"/>
+        </w:rPr>
+        <w:t>parámetros</w:t>
+      </w:r>
+      <w:r>
+        <w:rPr>
+          <w:color w:val="2C3E50"/>
+          <w:sz w:val="21"/>
+        </w:rPr>
+        <w:t>)</w:t>
       </w:r>
     </w:p>
     <w:p>
@@ -10808,7 +10814,7 @@
           <w:noProof/>
         </w:rPr>
         <w:drawing>
-          <wp:inline distT="0" distB="0" distL="0" distR="0" wp14:anchorId="6B1FDE83" wp14:editId="40A84013">
+          <wp:inline distT="0" distB="0" distL="0" distR="0" wp14:anchorId="7B118D7C" wp14:editId="6B6DB61F">
             <wp:extent cx="5400000" cy="3747641"/>
             <wp:effectExtent l="0" t="0" r="0" b="0"/>
             <wp:docPr id="2" name="Picture 2"/>
@@ -10882,7 +10888,7 @@
           <w:color w:val="FFFFFF"/>
           <w:sz w:val="26"/>
         </w:rPr>
-        <w:t>CRITERIOS DE ACEPTACION</w:t>
+        <w:t>CRITERIOS DE ACEPTACIÓN</w:t>
       </w:r>
     </w:p>
     <w:p/>
@@ -10894,7 +10900,7 @@
         <w:rPr>
           <w:color w:val="2C3E50"/>
         </w:rPr>
-        <w:t>Se definen los criterios de aceptacion para los requerimientos funcionales de mayor prioridad del sistema VetCare.</w:t>
+        <w:t>Se definen los criterios de aceptación para los requerimientos funcionales de mayor prioridad del sistema VetCare.</w:t>
       </w:r>
     </w:p>
     <w:tbl>
@@ -10970,7 +10976,7 @@
                 <w:color w:val="2C3E50"/>
                 <w:sz w:val="19"/>
               </w:rPr>
-              <w:t>Autenticacion de usuarios</w:t>
+              <w:t>Autenticación de usuarios</w:t>
             </w:r>
           </w:p>
         </w:tc>
@@ -10986,7 +10992,7 @@
                 <w:color w:val="2C3E50"/>
                 <w:sz w:val="17"/>
               </w:rPr>
-              <w:t>Criterio de aceptacion</w:t>
+              <w:t>Criterio de aceptación</w:t>
             </w:r>
             <w:r>
               <w:rPr>
@@ -11001,7 +11007,7 @@
                 <w:color w:val="2C3E50"/>
                 <w:sz w:val="18"/>
               </w:rPr>
-              <w:t>El sistema solo concede acceso cuando el usuario y la contrasena coincidan exactamente con los datos registrados. Ante tres intentos fallidos, bloquea el acceso.</w:t>
+              <w:t>El sistema solo concede acceso cuando el usuario y la contraseña coincidan exactamente con los datos registrados. Ante tres intentos fallidos, bloquea el acceso.</w:t>
             </w:r>
           </w:p>
         </w:tc>
@@ -11132,7 +11138,7 @@
                 <w:color w:val="2C3E50"/>
                 <w:sz w:val="17"/>
               </w:rPr>
-              <w:t>Criterio de aceptacion</w:t>
+              <w:t>Criterio de aceptación</w:t>
             </w:r>
             <w:r>
               <w:rPr>
@@ -11147,7 +11153,7 @@
                 <w:color w:val="2C3E50"/>
                 <w:sz w:val="18"/>
               </w:rPr>
-              <w:t>No debe ser posible guardar una mascota sin nombre, especie y dueno asignado. El sistema valida estos campos antes de confirmar el registro.</w:t>
+              <w:t>No debe ser posible guardar una mascota sin nombre, especie y dueño asignado. El sistema valida estos campos antes de confirmar el registro.</w:t>
             </w:r>
           </w:p>
         </w:tc>
@@ -11262,7 +11268,7 @@
                 <w:color w:val="2C3E50"/>
                 <w:sz w:val="19"/>
               </w:rPr>
-              <w:t>Unicidad de DNI del dueno</w:t>
+              <w:t>Unicidad de DNI del dueño</w:t>
             </w:r>
           </w:p>
         </w:tc>
@@ -11278,7 +11284,7 @@
                 <w:color w:val="2C3E50"/>
                 <w:sz w:val="17"/>
               </w:rPr>
-              <w:t>Criterio de aceptacion</w:t>
+              <w:t>Criterio de aceptación</w:t>
             </w:r>
             <w:r>
               <w:rPr>
@@ -11293,7 +11299,7 @@
                 <w:color w:val="2C3E50"/>
                 <w:sz w:val="18"/>
               </w:rPr>
-              <w:t>El sistema no permite registrar dos duenos con el mismo numero de DNI. Ante un DNI duplicado, muestra: 'Ya existe un dueno con ese DNI.'</w:t>
+              <w:t>El sistema no permite registrar dos dueños con el mismo número de DNI. Ante un DNI duplicado, muestra: 'Ya existe un dueño con ese DNI.'</w:t>
             </w:r>
           </w:p>
         </w:tc>
@@ -11424,7 +11430,7 @@
                 <w:color w:val="2C3E50"/>
                 <w:sz w:val="17"/>
               </w:rPr>
-              <w:t>Criterio de aceptacion</w:t>
+              <w:t>Criterio de aceptación</w:t>
             </w:r>
             <w:r>
               <w:rPr>
@@ -11554,7 +11560,7 @@
                 <w:color w:val="2C3E50"/>
                 <w:sz w:val="19"/>
               </w:rPr>
-              <w:t>Historial medico visible y ordenado</w:t>
+              <w:t>Historial médico visible y ordenado</w:t>
             </w:r>
           </w:p>
         </w:tc>
@@ -11570,7 +11576,7 @@
                 <w:color w:val="2C3E50"/>
                 <w:sz w:val="17"/>
               </w:rPr>
-              <w:t>Criterio de aceptacion</w:t>
+              <w:t>Criterio de aceptación</w:t>
             </w:r>
             <w:r>
               <w:rPr>
@@ -11585,7 +11591,7 @@
                 <w:color w:val="2C3E50"/>
                 <w:sz w:val="18"/>
               </w:rPr>
-              <w:t>El historial medico de una mascota se muestra con fecha, diagnostico y tratamiento en cada registro, vinculado unicamente a la mascota seleccionada.</w:t>
+              <w:t>El historial médico de una mascota se muestra con fecha, diagnóstico y tratamiento en cada registro, vinculado únicamente a la mascota seleccionada.</w:t>
             </w:r>
           </w:p>
         </w:tc>
@@ -11716,7 +11722,7 @@
                 <w:color w:val="2C3E50"/>
                 <w:sz w:val="17"/>
               </w:rPr>
-              <w:t>Criterio de aceptacion</w:t>
+              <w:t>Criterio de aceptación</w:t>
             </w:r>
             <w:r>
               <w:rPr>
@@ -11731,7 +11737,21 @@
                 <w:color w:val="2C3E50"/>
                 <w:sz w:val="18"/>
               </w:rPr>
-              <w:t>El sistema acepta registrar una consulta con uno (diagnostico), dos (diagnostico + tratamiento) o tres parametros (diagnostico + tratamiento + observaciones) sin lanzar excepciones.</w:t>
+              <w:t xml:space="preserve">El sistema acepta registrar una consulta con uno (diagnóstico), dos (diagnóstico + tratamiento) o tres </w:t>
+            </w:r>
+            <w:r>
+              <w:rPr>
+                <w:color w:val="2C3E50"/>
+                <w:sz w:val="18"/>
+              </w:rPr>
+              <w:t>parámetros</w:t>
+            </w:r>
+            <w:r>
+              <w:rPr>
+                <w:color w:val="2C3E50"/>
+                <w:sz w:val="18"/>
+              </w:rPr>
+              <w:t xml:space="preserve"> (diagnóstico + tratamiento + observaciones) sin lanzar excepciones.</w:t>
             </w:r>
           </w:p>
         </w:tc>
@@ -11862,7 +11882,7 @@
                 <w:color w:val="2C3E50"/>
                 <w:sz w:val="17"/>
               </w:rPr>
-              <w:t>Criterio de aceptacion</w:t>
+              <w:t>Criterio de aceptación</w:t>
             </w:r>
             <w:r>
               <w:rPr>
@@ -11877,7 +11897,7 @@
                 <w:color w:val="2C3E50"/>
                 <w:sz w:val="18"/>
               </w:rPr>
-              <w:t>Los datos registrados en una sesion deben estar disponibles al reiniciar el sistema, sin perdida de informacion, gracias a la persistencia en archivos .txt.</w:t>
+              <w:t>Los datos registrados en una sesión deben estar disponibles al reiniciar el sistema, sin pérdida de información, gracias a la persistencia en archivos .txt.</w:t>
             </w:r>
           </w:p>
         </w:tc>
@@ -12008,7 +12028,7 @@
                 <w:color w:val="2C3E50"/>
                 <w:sz w:val="17"/>
               </w:rPr>
-              <w:t>Criterio de aceptacion</w:t>
+              <w:t>Criterio de aceptación</w:t>
             </w:r>
             <w:r>
               <w:rPr>
@@ -12023,7 +12043,7 @@
                 <w:color w:val="2C3E50"/>
                 <w:sz w:val="18"/>
               </w:rPr>
-              <w:t>Al filtrar mascotas por especie (Perro, Gato o Ave), el sistema muestra unicamente las mascotas de esa categoria, sin incluir mascotas de otras especies.</w:t>
+              <w:t>Al filtrar mascotas por especie (Perro, Gato o Ave), el sistema muestra únicamente las mascotas de esa categoría, sin incluir mascotas de otras especies.</w:t>
             </w:r>
           </w:p>
         </w:tc>
@@ -12138,7 +12158,7 @@
                 <w:color w:val="2C3E50"/>
                 <w:sz w:val="19"/>
               </w:rPr>
-              <w:t>Cancelacion de cita con motivo</w:t>
+              <w:t>Cancelación de cita con motivo</w:t>
             </w:r>
           </w:p>
         </w:tc>
@@ -12154,7 +12174,7 @@
                 <w:color w:val="2C3E50"/>
                 <w:sz w:val="17"/>
               </w:rPr>
-              <w:t>Criterio de aceptacion</w:t>
+              <w:t>Criterio de aceptación</w:t>
             </w:r>
             <w:r>
               <w:rPr>
@@ -12169,7 +12189,7 @@
                 <w:color w:val="2C3E50"/>
                 <w:sz w:val="18"/>
               </w:rPr>
-              <w:t>Solo se pueden cancelar citas con estado 'Pendiente'. El sistema rechaza la cancelacion de citas 'Atendidas' y muestra un mensaje de error claro.</w:t>
+              <w:t>Solo se pueden cancelar citas con estado 'Pendiente'. El sistema rechaza la cancelación de citas 'Atendidas' y muestra un mensaje de error claro.</w:t>
             </w:r>
           </w:p>
         </w:tc>
@@ -12284,7 +12304,7 @@
                 <w:color w:val="2C3E50"/>
                 <w:sz w:val="19"/>
               </w:rPr>
-              <w:t>Desactivacion de veterinario sin eliminacion</w:t>
+              <w:t>Desactivación de veterinario sin eliminación</w:t>
             </w:r>
           </w:p>
         </w:tc>
@@ -12300,7 +12320,7 @@
                 <w:color w:val="2C3E50"/>
                 <w:sz w:val="17"/>
               </w:rPr>
-              <w:t>Criterio de aceptacion</w:t>
+              <w:t>Criterio de aceptación</w:t>
             </w:r>
             <w:r>
               <w:rPr>
@@ -12315,7 +12335,21 @@
                 <w:color w:val="2C3E50"/>
                 <w:sz w:val="18"/>
               </w:rPr>
-              <w:t>Al desactivar un veterinario, este deja de aparecer en el listado de activos pero sus citas y datos historicos permanecen en el sistema.</w:t>
+              <w:t xml:space="preserve">Al desactivar un veterinario, este deja de aparecer en el listado de </w:t>
+            </w:r>
+            <w:r>
+              <w:rPr>
+                <w:color w:val="2C3E50"/>
+                <w:sz w:val="18"/>
+              </w:rPr>
+              <w:t>activos,</w:t>
+            </w:r>
+            <w:r>
+              <w:rPr>
+                <w:color w:val="2C3E50"/>
+                <w:sz w:val="18"/>
+              </w:rPr>
+              <w:t xml:space="preserve"> pero sus citas y datos históricos permanecen en el sistema.</w:t>
             </w:r>
           </w:p>
         </w:tc>
@@ -12382,7 +12416,7 @@
           <w:color w:val="FFFFFF"/>
           <w:sz w:val="26"/>
         </w:rPr>
-        <w:t>IMPLEMENTACION DEL PROYECTO</w:t>
+        <w:t>IMPLEMENTACIÓN DEL PROYECTO</w:t>
       </w:r>
     </w:p>
     <w:p/>
@@ -12394,7 +12428,7 @@
         <w:rPr>
           <w:color w:val="2C3E50"/>
         </w:rPr>
-        <w:t>Esta seccion describe las decisiones tecnicas, herramientas y estrategias utilizadas en el desarrollo del sistema VetCare en Java.</w:t>
+        <w:t>Esta sección describe las decisiones técnicas, herramientas y estrategias utilizadas en el desarrollo del sistema VetCare en Java.</w:t>
       </w:r>
     </w:p>
     <w:p>
@@ -12406,7 +12440,7 @@
           <w:b/>
           <w:color w:val="145A32"/>
         </w:rPr>
-        <w:t xml:space="preserve">  10.1  Tecnologias Utilizadas</w:t>
+        <w:t xml:space="preserve">  10.1  Tecnologías Utilizadas</w:t>
       </w:r>
     </w:p>
     <w:tbl>
@@ -12436,7 +12470,7 @@
                 <w:color w:val="FFFFFF"/>
                 <w:sz w:val="19"/>
               </w:rPr>
-              <w:t>Tecnologia</w:t>
+              <w:t>Tecnología</w:t>
             </w:r>
           </w:p>
         </w:tc>
@@ -12455,7 +12489,7 @@
                 <w:color w:val="FFFFFF"/>
                 <w:sz w:val="19"/>
               </w:rPr>
-              <w:t>Version / Detalle</w:t>
+              <w:t>Versión / Detalle</w:t>
             </w:r>
           </w:p>
         </w:tc>
@@ -12522,7 +12556,7 @@
                 <w:color w:val="2C3E50"/>
                 <w:sz w:val="19"/>
               </w:rPr>
-              <w:t>Lenguaje de programacion principal. Aplicacion de POO, colecciones y manejo de archivos.</w:t>
+              <w:t>Lenguaje de programación principal. Aplicación de POO, colecciones y manejo de archivos.</w:t>
             </w:r>
           </w:p>
         </w:tc>
@@ -12570,7 +12604,7 @@
                 <w:color w:val="2C3E50"/>
                 <w:sz w:val="19"/>
               </w:rPr>
-              <w:t>Entorno de desarrollo integrado. Compilacion, depuracion y gestion del workspace.</w:t>
+              <w:t>Entorno de desarrollo integrado. Compilación, depuración y gestión del workspace.</w:t>
             </w:r>
           </w:p>
         </w:tc>
@@ -12666,7 +12700,7 @@
                 <w:color w:val="2C3E50"/>
                 <w:sz w:val="19"/>
               </w:rPr>
-              <w:t>Repositorio remoto. Respaldo y entrega del codigo fuente con historial de commits.</w:t>
+              <w:t>Repositorio remoto. Respaldo y entrega del código fuente con historial de commits.</w:t>
             </w:r>
           </w:p>
         </w:tc>
@@ -12742,7 +12776,19 @@
         <w:rPr>
           <w:color w:val="2C3E50"/>
         </w:rPr>
-        <w:t>VetCare implementa su interfaz gráfica con la biblioteca Java Swing. La clase MainFrame (JFrame) actúa como contenedor principal con un JTabbedPane de 5 pestañas. Cada pestaña es un JPanel independiente (PanelMascotas, PanelDuenos, PanelVeterinarios, PanelCitas, PanelHistorial) que usa JTable + DefaultTableModel para mostrar los datos cargados desde MySQL. El acceso se protege con LoginFrame (JDialog con autenticación admin/vetcare2026). Los eventos se registran mediante expresiones lambda como ActionListener (Java 8).</w:t>
+        <w:t xml:space="preserve">VetCare implementa su interfaz gráfica con la biblioteca Java Swing. La clase MainFrame (JFrame) actúa como contenedor principal con un JTabbedPane de 5 pestañas. Cada pestaña es un JPanel independiente (PanelMascotas, </w:t>
+      </w:r>
+      <w:r>
+        <w:rPr>
+          <w:color w:val="2C3E50"/>
+        </w:rPr>
+        <w:t>PanelDueños</w:t>
+      </w:r>
+      <w:r>
+        <w:rPr>
+          <w:color w:val="2C3E50"/>
+        </w:rPr>
+        <w:t>, PanelVeterinarios, PanelCitas, PanelHistorial) que usa JTable + DefaultTableModel para mostrar los datos cargados desde MySQL. El acceso se protege con LoginFrame (JDialog con autenticación admin/vetcare2026). Los eventos se registran mediante expresiones lambda como ActionListener (Java 8).</w:t>
       </w:r>
     </w:p>
     <w:p>
@@ -12750,83 +12796,30 @@
         <w:spacing w:after="80"/>
         <w:ind w:left="283"/>
       </w:pPr>
-      <w:r>
-        <w:rPr>
-          <w:color w:val="2C3E50"/>
-        </w:rPr>
-      </w:r>
     </w:p>
     <w:p>
       <w:pPr>
         <w:spacing w:after="40"/>
         <w:ind w:left="454"/>
       </w:pPr>
-      <w:r>
-        <w:rPr>
-          <w:color w:val="1E8B4F"/>
-          <w:sz w:val="20"/>
-        </w:rPr>
-      </w:r>
-      <w:r>
-        <w:rPr>
-          <w:color w:val="2C3E50"/>
-          <w:sz w:val="21"/>
-        </w:rPr>
-      </w:r>
     </w:p>
     <w:p>
       <w:pPr>
         <w:spacing w:after="40"/>
         <w:ind w:left="454"/>
       </w:pPr>
-      <w:r>
-        <w:rPr>
-          <w:color w:val="1E8B4F"/>
-          <w:sz w:val="20"/>
-        </w:rPr>
-      </w:r>
-      <w:r>
-        <w:rPr>
-          <w:color w:val="2C3E50"/>
-          <w:sz w:val="21"/>
-        </w:rPr>
-      </w:r>
     </w:p>
     <w:p>
       <w:pPr>
         <w:spacing w:after="40"/>
         <w:ind w:left="454"/>
       </w:pPr>
-      <w:r>
-        <w:rPr>
-          <w:color w:val="1E8B4F"/>
-          <w:sz w:val="20"/>
-        </w:rPr>
-      </w:r>
-      <w:r>
-        <w:rPr>
-          <w:color w:val="2C3E50"/>
-          <w:sz w:val="21"/>
-        </w:rPr>
-      </w:r>
     </w:p>
     <w:p>
       <w:pPr>
         <w:spacing w:after="40"/>
         <w:ind w:left="454"/>
       </w:pPr>
-      <w:r>
-        <w:rPr>
-          <w:color w:val="1E8B4F"/>
-          <w:sz w:val="20"/>
-        </w:rPr>
-      </w:r>
-      <w:r>
-        <w:rPr>
-          <w:color w:val="2C3E50"/>
-          <w:sz w:val="21"/>
-        </w:rPr>
-      </w:r>
     </w:p>
     <w:p/>
     <w:p>
@@ -12875,12 +12868,6 @@
         </w:rPr>
         <w:t>▸  vetcare.gui.MainGUI               - Punto de entrada (lanza LoginFrame)</w:t>
       </w:r>
-      <w:r>
-        <w:rPr>
-          <w:color w:val="2C3E50"/>
-          <w:sz w:val="21"/>
-        </w:rPr>
-      </w:r>
     </w:p>
     <w:p>
       <w:pPr>
@@ -12894,12 +12881,6 @@
         </w:rPr>
         <w:t>▸  vetcare.gui.LoginFrame             - Autenticación (JDialog)</w:t>
       </w:r>
-      <w:r>
-        <w:rPr>
-          <w:color w:val="2C3E50"/>
-          <w:sz w:val="21"/>
-        </w:rPr>
-      </w:r>
     </w:p>
     <w:p>
       <w:pPr>
@@ -12913,12 +12894,6 @@
         </w:rPr>
         <w:t>▸  vetcare.gui.MainFrame              - Ventana principal (JFrame + JTabbedPane)</w:t>
       </w:r>
-      <w:r>
-        <w:rPr>
-          <w:color w:val="2C3E50"/>
-          <w:sz w:val="21"/>
-        </w:rPr>
-      </w:r>
     </w:p>
     <w:p>
       <w:pPr>
@@ -12930,13 +12905,8 @@
           <w:color w:val="1E8B4F"/>
           <w:sz w:val="20"/>
         </w:rPr>
+        <w:lastRenderedPageBreak/>
         <w:t>▸  vetcare.gui.Panel*.java            - 5 paneles CRUD (Mascotas, Dueños, Vets, Citas, Historial)</w:t>
-      </w:r>
-      <w:r>
-        <w:rPr>
-          <w:color w:val="2C3E50"/>
-          <w:sz w:val="21"/>
-        </w:rPr>
       </w:r>
     </w:p>
     <w:p>
@@ -12951,12 +12921,6 @@
         </w:rPr>
         <w:t>▸  vetcare.modelo.*                   - Clases de dominio (Animal, Mascota, Dueno, Veterinario, Cita, ConsultaMedica)</w:t>
       </w:r>
-      <w:r>
-        <w:rPr>
-          <w:color w:val="2C3E50"/>
-          <w:sz w:val="21"/>
-        </w:rPr>
-      </w:r>
     </w:p>
     <w:p>
       <w:pPr>
@@ -12968,13 +12932,21 @@
           <w:color w:val="1E8B4F"/>
           <w:sz w:val="20"/>
         </w:rPr>
-        <w:t>▸  vetcare.db.*                       - Capa DAO: ConexionDB (Singleton JDBC) + DuenoDB, VeterinarioDB, MascotaDB, CitaDB, ConsultaDB</w:t>
-      </w:r>
-      <w:r>
-        <w:rPr>
-          <w:color w:val="2C3E50"/>
-          <w:sz w:val="21"/>
-        </w:rPr>
+        <w:t>▸  vetcare.db.*                       - Capa DAO: ConexionDB (Singleton JDBC) + Due</w:t>
+      </w:r>
+      <w:r>
+        <w:rPr>
+          <w:color w:val="1E8B4F"/>
+          <w:sz w:val="20"/>
+        </w:rPr>
+        <w:t>ñ</w:t>
+      </w:r>
+      <w:r>
+        <w:rPr>
+          <w:color w:val="1E8B4F"/>
+          <w:sz w:val="20"/>
+        </w:rPr>
+        <w:t>oDB, VeterinarioDB, MascotaDB, CitaDB, ConsultaDB</w:t>
       </w:r>
     </w:p>
     <w:p>
@@ -12989,12 +12961,6 @@
         </w:rPr>
         <w:t>▸  vetcare.interfaces.IGestionable&lt;T&gt; - Interfaz genérica implementada por las clases DAO</w:t>
       </w:r>
-      <w:r>
-        <w:rPr>
-          <w:color w:val="2C3E50"/>
-          <w:sz w:val="21"/>
-        </w:rPr>
-      </w:r>
     </w:p>
     <w:p>
       <w:pPr>
@@ -13006,13 +12972,28 @@
           <w:color w:val="1E8B4F"/>
           <w:sz w:val="20"/>
         </w:rPr>
-        <w:t>▸  vetcare_db (MySQL)                 - 5 tablas: duenos, veterinarios, mascotas, citas, consultas_medicas</w:t>
-      </w:r>
-      <w:r>
-        <w:rPr>
-          <w:color w:val="2C3E50"/>
-          <w:sz w:val="21"/>
-        </w:rPr>
+        <w:t>▸  vetcare_db (MySQL)                 - 5 tablas: due</w:t>
+      </w:r>
+      <w:r>
+        <w:rPr>
+          <w:color w:val="1E8B4F"/>
+          <w:sz w:val="20"/>
+        </w:rPr>
+        <w:t>ñ</w:t>
+      </w:r>
+      <w:r>
+        <w:rPr>
+          <w:color w:val="1E8B4F"/>
+          <w:sz w:val="20"/>
+        </w:rPr>
+        <w:t xml:space="preserve">os, veterinarios, mascotas, citas, </w:t>
+      </w:r>
+      <w:r>
+        <w:rPr>
+          <w:color w:val="1E8B4F"/>
+          <w:sz w:val="20"/>
+        </w:rPr>
+        <w:t>consultas medicas</w:t>
       </w:r>
     </w:p>
     <w:p>
@@ -13026,12 +13007,6 @@
           <w:sz w:val="20"/>
         </w:rPr>
         <w:t>▸  db/vetcare_db.sql                  - Script DDL con CREATE TABLE, FK y charset utf8mb4</w:t>
-      </w:r>
-      <w:r>
-        <w:rPr>
-          <w:color w:val="2C3E50"/>
-          <w:sz w:val="21"/>
-        </w:rPr>
       </w:r>
     </w:p>
     <w:p>
@@ -13071,7 +13046,7 @@
         <w:rPr>
           <w:color w:val="2C3E50"/>
         </w:rPr>
-        <w:t>Esta seccion presenta el estado de implementacion de los 40 requerimientos funcionales y las evidencias del funcionamiento del sistema VetCare.</w:t>
+        <w:t>Esta sección presenta el estado de implementación de los 40 requerimientos funcionales y las evidencias del funcionamiento del sistema VetCare.</w:t>
       </w:r>
     </w:p>
     <w:p>
@@ -13152,7 +13127,7 @@
                 <w:color w:val="FFFFFF"/>
                 <w:sz w:val="19"/>
               </w:rPr>
-              <w:t>Modulo</w:t>
+              <w:t>Módulo</w:t>
             </w:r>
           </w:p>
         </w:tc>
@@ -13204,7 +13179,7 @@
                 <w:color w:val="2C3E50"/>
                 <w:sz w:val="18"/>
               </w:rPr>
-              <w:t>Iniciar sesion</w:t>
+              <w:t>Iniciar sesión</w:t>
             </w:r>
           </w:p>
         </w:tc>
@@ -13219,7 +13194,7 @@
                 <w:color w:val="2C3E50"/>
                 <w:sz w:val="18"/>
               </w:rPr>
-              <w:t>Autenticacion</w:t>
+              <w:t>Autenticación</w:t>
             </w:r>
           </w:p>
         </w:tc>
@@ -13268,7 +13243,7 @@
                 <w:color w:val="2C3E50"/>
                 <w:sz w:val="18"/>
               </w:rPr>
-              <w:t>Cerrar sesion</w:t>
+              <w:t>Cerrar sesión</w:t>
             </w:r>
           </w:p>
         </w:tc>
@@ -13283,7 +13258,7 @@
                 <w:color w:val="2C3E50"/>
                 <w:sz w:val="18"/>
               </w:rPr>
-              <w:t>Autenticacion</w:t>
+              <w:t>Autenticación</w:t>
             </w:r>
           </w:p>
         </w:tc>
@@ -13332,7 +13307,7 @@
                 <w:color w:val="2C3E50"/>
                 <w:sz w:val="18"/>
               </w:rPr>
-              <w:t>Cambiar contrasena</w:t>
+              <w:t>Cambiar contraseña</w:t>
             </w:r>
           </w:p>
         </w:tc>
@@ -13347,7 +13322,7 @@
                 <w:color w:val="2C3E50"/>
                 <w:sz w:val="18"/>
               </w:rPr>
-              <w:t>Autenticacion</w:t>
+              <w:t>Autenticación</w:t>
             </w:r>
           </w:p>
         </w:tc>
@@ -13410,7 +13385,7 @@
                 <w:color w:val="2C3E50"/>
                 <w:sz w:val="18"/>
               </w:rPr>
-              <w:t>Autenticacion</w:t>
+              <w:t>Autenticación</w:t>
             </w:r>
           </w:p>
         </w:tc>
@@ -13713,7 +13688,7 @@
                 <w:color w:val="2C3E50"/>
                 <w:sz w:val="18"/>
               </w:rPr>
-              <w:t>Buscar por dueno</w:t>
+              <w:t>Buscar por dueño</w:t>
             </w:r>
           </w:p>
         </w:tc>
@@ -14161,7 +14136,7 @@
                 <w:color w:val="2C3E50"/>
                 <w:sz w:val="18"/>
               </w:rPr>
-              <w:t>Registrar dueno</w:t>
+              <w:t>Registrar dueño</w:t>
             </w:r>
           </w:p>
         </w:tc>
@@ -14176,7 +14151,7 @@
                 <w:color w:val="2C3E50"/>
                 <w:sz w:val="18"/>
               </w:rPr>
-              <w:t>Duenos</w:t>
+              <w:t>Dueños</w:t>
             </w:r>
           </w:p>
         </w:tc>
@@ -14225,7 +14200,7 @@
                 <w:color w:val="2C3E50"/>
                 <w:sz w:val="18"/>
               </w:rPr>
-              <w:t>Modificar dueno</w:t>
+              <w:t>Modificar dueño</w:t>
             </w:r>
           </w:p>
         </w:tc>
@@ -14240,7 +14215,7 @@
                 <w:color w:val="2C3E50"/>
                 <w:sz w:val="18"/>
               </w:rPr>
-              <w:t>Duenos</w:t>
+              <w:t>Dueños</w:t>
             </w:r>
           </w:p>
         </w:tc>
@@ -14288,7 +14263,7 @@
                 <w:color w:val="2C3E50"/>
                 <w:sz w:val="18"/>
               </w:rPr>
-              <w:t>Eliminar dueno</w:t>
+              <w:t>Eliminar dueño</w:t>
             </w:r>
           </w:p>
         </w:tc>
@@ -14303,7 +14278,7 @@
                 <w:color w:val="2C3E50"/>
                 <w:sz w:val="18"/>
               </w:rPr>
-              <w:t>Duenos</w:t>
+              <w:t>Dueños</w:t>
             </w:r>
           </w:p>
         </w:tc>
@@ -14351,7 +14326,7 @@
                 <w:color w:val="2C3E50"/>
                 <w:sz w:val="18"/>
               </w:rPr>
-              <w:t>Buscar dueno por nombre</w:t>
+              <w:t>Buscar dueño por nombre</w:t>
             </w:r>
           </w:p>
         </w:tc>
@@ -14366,7 +14341,7 @@
                 <w:color w:val="2C3E50"/>
                 <w:sz w:val="18"/>
               </w:rPr>
-              <w:t>Duenos</w:t>
+              <w:t>Dueños</w:t>
             </w:r>
           </w:p>
         </w:tc>
@@ -14414,7 +14389,7 @@
                 <w:color w:val="2C3E50"/>
                 <w:sz w:val="18"/>
               </w:rPr>
-              <w:t>Buscar dueno por DNI</w:t>
+              <w:t>Buscar dueño por DNI</w:t>
             </w:r>
           </w:p>
         </w:tc>
@@ -14429,7 +14404,7 @@
                 <w:color w:val="2C3E50"/>
                 <w:sz w:val="18"/>
               </w:rPr>
-              <w:t>Duenos</w:t>
+              <w:t>Dueños</w:t>
             </w:r>
           </w:p>
         </w:tc>
@@ -14478,7 +14453,7 @@
                 <w:color w:val="2C3E50"/>
                 <w:sz w:val="18"/>
               </w:rPr>
-              <w:t>Listar duenos</w:t>
+              <w:t>Listar dueños</w:t>
             </w:r>
           </w:p>
         </w:tc>
@@ -14493,7 +14468,7 @@
                 <w:color w:val="2C3E50"/>
                 <w:sz w:val="18"/>
               </w:rPr>
-              <w:t>Duenos</w:t>
+              <w:t>Dueños</w:t>
             </w:r>
           </w:p>
         </w:tc>
@@ -14542,7 +14517,7 @@
                 <w:color w:val="2C3E50"/>
                 <w:sz w:val="18"/>
               </w:rPr>
-              <w:t>Ver mascotas del dueno</w:t>
+              <w:t>Ver mascotas del dueño</w:t>
             </w:r>
           </w:p>
         </w:tc>
@@ -14557,7 +14532,7 @@
                 <w:color w:val="2C3E50"/>
                 <w:sz w:val="18"/>
               </w:rPr>
-              <w:t>Duenos</w:t>
+              <w:t>Dueños</w:t>
             </w:r>
           </w:p>
         </w:tc>
@@ -14797,7 +14772,7 @@
                 <w:color w:val="2C3E50"/>
                 <w:sz w:val="18"/>
               </w:rPr>
-              <w:t>Citas del dia</w:t>
+              <w:t>Citas del día</w:t>
             </w:r>
           </w:p>
         </w:tc>
@@ -15435,7 +15410,14 @@
                 <w:color w:val="2C3E50"/>
                 <w:sz w:val="18"/>
               </w:rPr>
-              <w:t>Ver agenda veterinario</w:t>
+              <w:t xml:space="preserve">Ver </w:t>
+            </w:r>
+            <w:r>
+              <w:rPr>
+                <w:color w:val="2C3E50"/>
+                <w:sz w:val="18"/>
+              </w:rPr>
+              <w:t>agenda veterinario</w:t>
             </w:r>
           </w:p>
         </w:tc>
@@ -15749,6 +15731,7 @@
           <w:b/>
           <w:color w:val="145A32"/>
         </w:rPr>
+        <w:lastRenderedPageBreak/>
         <w:t xml:space="preserve">  11.2  Evidencias del Sistema</w:t>
       </w:r>
     </w:p>
@@ -15761,7 +15744,19 @@
         <w:rPr>
           <w:color w:val="2C3E50"/>
         </w:rPr>
-        <w:t>Las capturas de pantalla del sistema en ejecución se encuentran en la carpeta Documentacion/screenshots/ y en el Informe de Aprendizaje (VetCare_InformeAprendizaje.html).</w:t>
+        <w:t xml:space="preserve">Las capturas de pantalla del sistema en ejecución se encuentran en la carpeta </w:t>
+      </w:r>
+      <w:r>
+        <w:rPr>
+          <w:color w:val="2C3E50"/>
+        </w:rPr>
+        <w:t>Documentación</w:t>
+      </w:r>
+      <w:r>
+        <w:rPr>
+          <w:color w:val="2C3E50"/>
+        </w:rPr>
+        <w:t>/screenshots/ y en el Informe de Aprendizaje (VetCare_InformeAprendizaje.html).</w:t>
       </w:r>
     </w:p>
     <w:p>
@@ -15776,12 +15771,6 @@
         </w:rPr>
         <w:t>▸  Login (LoginFrame): ventana de autenticación con campos Usuario y Contraseña, control de acceso.</w:t>
       </w:r>
-      <w:r>
-        <w:rPr>
-          <w:color w:val="2C3E50"/>
-          <w:sz w:val="21"/>
-        </w:rPr>
-      </w:r>
     </w:p>
     <w:p>
       <w:pPr>
@@ -15795,12 +15784,6 @@
         </w:rPr>
         <w:t>▸  MainFrame: ventana principal con JTabbedPane de 5 pestañas (Mascotas, Dueños, Veterinarios, Citas, Historial).</w:t>
       </w:r>
-      <w:r>
-        <w:rPr>
-          <w:color w:val="2C3E50"/>
-          <w:sz w:val="21"/>
-        </w:rPr>
-      </w:r>
     </w:p>
     <w:p>
       <w:pPr>
@@ -15814,12 +15797,6 @@
         </w:rPr>
         <w:t>▸  Pestaña Mascotas: JTable con 7 registros (Perro, Gato, Ave), búsqueda por nombre, formulario JOptionPane.</w:t>
       </w:r>
-      <w:r>
-        <w:rPr>
-          <w:color w:val="2C3E50"/>
-          <w:sz w:val="21"/>
-        </w:rPr>
-      </w:r>
     </w:p>
     <w:p>
       <w:pPr>
@@ -15833,12 +15810,6 @@
         </w:rPr>
         <w:t>▸  Pestaña Dueños: JTable con 5 dueños, búsqueda por nombre o DNI, alta con validación de DNI único.</w:t>
       </w:r>
-      <w:r>
-        <w:rPr>
-          <w:color w:val="2C3E50"/>
-          <w:sz w:val="21"/>
-        </w:rPr>
-      </w:r>
     </w:p>
     <w:p>
       <w:pPr>
@@ -15852,12 +15823,6 @@
         </w:rPr>
         <w:t>▸  Pestaña Citas: JTable con 6 citas, estados PENDIENTE/ATENDIDA/CANCELADA/NO_ASISTIO, detección de conflictos.</w:t>
       </w:r>
-      <w:r>
-        <w:rPr>
-          <w:color w:val="2C3E50"/>
-          <w:sz w:val="21"/>
-        </w:rPr>
-      </w:r>
     </w:p>
     <w:p>
       <w:pPr>
@@ -15871,12 +15836,6 @@
         </w:rPr>
         <w:t>▸  Pestaña Historial: selector de mascota por ComboBox, JTable con consultas médicas del paciente seleccionado.</w:t>
       </w:r>
-      <w:r>
-        <w:rPr>
-          <w:color w:val="2C3E50"/>
-          <w:sz w:val="21"/>
-        </w:rPr>
-      </w:r>
     </w:p>
     <w:p>
       <w:pPr>
@@ -15890,12 +15849,6 @@
         </w:rPr>
         <w:t>▸  Pestaña Veterinarios: JTable con 5 veterinarios, especialidad, colegiatura y estado activo/inactivo.</w:t>
       </w:r>
-      <w:r>
-        <w:rPr>
-          <w:color w:val="2C3E50"/>
-          <w:sz w:val="21"/>
-        </w:rPr>
-      </w:r>
     </w:p>
     <w:p>
       <w:pPr>
@@ -15905,7 +15858,19 @@
         <w:rPr>
           <w:color w:val="2C3E50"/>
         </w:rPr>
-        <w:t>Ver capturas en: Documentacion/screenshots/ (01_login.png a 06_historial.png).</w:t>
+        <w:t xml:space="preserve">Ver capturas en: </w:t>
+      </w:r>
+      <w:r>
+        <w:rPr>
+          <w:color w:val="2C3E50"/>
+        </w:rPr>
+        <w:t>Documentación</w:t>
+      </w:r>
+      <w:r>
+        <w:rPr>
+          <w:color w:val="2C3E50"/>
+        </w:rPr>
+        <w:t>/screenshots/ (01_login.png a 06_historial.png).</w:t>
       </w:r>
     </w:p>
     <w:p>
@@ -15953,7 +15918,7 @@
         <w:rPr>
           <w:color w:val="2C3E50"/>
         </w:rPr>
-        <w:t>El sistema VetCare demuestra que la Programacion Orientada a Objetos permite modelar de manera natural y eficiente las entidades del dominio veterinario. La jerarquia de clases (Animal hacia Perro, Gato y Ave; Persona hacia Dueno y Veterinario) redujo la duplicacion de codigo y facilito la extension del sistema, validando el uso de herencia y polimorfismo como pilares del diseno.</w:t>
+        <w:t>El sistema VetCare demuestra que la Programación Orientada a Objetos permite modelar de manera natural y eficiente las entidades del dominio veterinario. La jerarquía de clases (Animal hacia Perro, Gato y Ave; Persona hacia Dueno y Veterinario) redujo la duplicación de código y facilitó la extensión del sistema, validando el uso de herencia y polimorfismo como pilares del diseño.</w:t>
       </w:r>
     </w:p>
     <w:p>
@@ -15968,11 +15933,6 @@
         </w:rPr>
         <w:t>2.  La implementación completa de los 40 requerimientos funcionales definidos evidencia que el sistema cubre el núcleo operativo de una clínica veterinaria: registro de pacientes con herencia de clases (Animal→Perro/Gato/Ave), gestión de citas con control de conflictos, historial médico por paciente y persistencia en MySQL. El sistema está desplegado y probado con datos reales.</w:t>
       </w:r>
-      <w:r>
-        <w:rPr>
-          <w:color w:val="2C3E50"/>
-        </w:rPr>
-      </w:r>
     </w:p>
     <w:p>
       <w:pPr>
@@ -15990,7 +15950,7 @@
         <w:rPr>
           <w:color w:val="2C3E50"/>
         </w:rPr>
-        <w:t>El uso de interfaces (IGestionable&lt;T&gt;) e internamente de ArrayList de Java permitio crear gestores de mascotas y citas reutilizables y extensibles. Esto confirma que el uso de colecciones genericas y contratos de interfaz es una practica solida en sistemas de gestion desarrollados con Java SE.</w:t>
+        <w:t>El uso de interfaces (IGestionable&lt;T&gt;) e internamente de ArrayList de Java permitió crear gestores de mascotas y citas reutilizables y extensibles. Esto confirma que el uso de colecciones genéricas y contratos de interfaz es una práctica sólida en sistemas de gestión desarrollados con Java SE.</w:t>
       </w:r>
     </w:p>
     <w:p>
@@ -16005,11 +15965,6 @@
         </w:rPr>
         <w:t>4.  La integración con MySQL 8.0 mediante JDBC (patrón DAO + Singleton ConexionDB) garantizó la persistencia real de los datos entre sesiones. El uso de PreparedStatement protegió contra inyección SQL, y el charset utf8mb4 aseguró el soporte completo de tildes y caracteres especiales del español, verificado en producción con Docker.</w:t>
       </w:r>
-      <w:r>
-        <w:rPr>
-          <w:color w:val="2C3E50"/>
-        </w:rPr>
-      </w:r>
     </w:p>
     <w:p>
       <w:pPr>
@@ -16027,7 +15982,7 @@
         <w:rPr>
           <w:color w:val="2C3E50"/>
         </w:rPr>
-        <w:t>El uso de Git y GitHub como herramienta de control de versiones permitio mantener un historial completo del avance del proyecto, facilitar el trabajo incremental y generar evidencia objetiva del desarrollo realizado durante el ciclo academico.</w:t>
+        <w:t>El uso de Git y GitHub como herramienta de control de versiones permitió mantener un historial completo del avance del proyecto, facilitar el trabajo incremental y generar evidencia objetiva del desarrollo realizado durante el ciclo académico.</w:t>
       </w:r>
     </w:p>
     <w:p>
@@ -16055,7 +16010,7 @@
           <w:color w:val="FFFFFF"/>
           <w:sz w:val="26"/>
         </w:rPr>
-        <w:t>BIBLIOGRAFIA</w:t>
+        <w:t>BIBLIOGRAFÍA</w:t>
       </w:r>
     </w:p>
     <w:p/>
@@ -16067,7 +16022,7 @@
         <w:rPr>
           <w:color w:val="2C3E50"/>
         </w:rPr>
-        <w:t>Referencias bibliograficas en formato APA utilizadas como sustento del proyecto.</w:t>
+        <w:t>Referencias bibliográficas en formato APA utilizadas como sustento del proyecto.</w:t>
       </w:r>
     </w:p>
     <w:p/>
@@ -16081,7 +16036,7 @@
           <w:color w:val="2C3E50"/>
           <w:sz w:val="21"/>
         </w:rPr>
-        <w:t>Barrientos, J., &amp; Molina, P. (2020). Sistema de informacion para la gestion de clinicas veterinarias. Repositorio Universidad de Guayaquil. http://repositorio.ug.edu.ec</w:t>
+        <w:t>Barrientos, J., &amp; Molina, P. (2020). Sistema de información para la gestión de clínicas veterinarias. Repositorio Universidad de Guayaquil. http://repositorio.ug.edu.ec</w:t>
       </w:r>
     </w:p>
     <w:p>
@@ -16094,7 +16049,7 @@
           <w:color w:val="2C3E50"/>
           <w:sz w:val="21"/>
         </w:rPr>
-        <w:t>Deitel, P. J., &amp; Deitel, H. M. (2012). Java: Como programar (9.a ed.). Pearson Educacion.</w:t>
+        <w:t>Deitel, P. J., &amp; Deitel, H. M. (2012). Java: Como programar (9.a ed.). Pearson Educación.</w:t>
       </w:r>
     </w:p>
     <w:p>
@@ -16107,7 +16062,7 @@
           <w:color w:val="2C3E50"/>
           <w:sz w:val="21"/>
         </w:rPr>
-        <w:t>Quispe, A., &amp; Vargas, L. (2023). Desarrollo de software de escritorio para la gestion de consultas en clinicas veterinarias de Lima Metropolitana. Repositorio Institucional USIL. https://repositorio.usil.edu.pe</w:t>
+        <w:t>Quispe, A., &amp; Vargas, L. (2023). Desarrollo de software de escritorio para la gestión de consultas en clínicas veterinarias de Lima Metropolitana. Repositorio Institucional USIL. https://repositorio.usil.edu.pe</w:t>
       </w:r>
     </w:p>
     <w:p>
@@ -16188,7 +16143,7 @@
           <w:color w:val="1E8B4F"/>
           <w:sz w:val="21"/>
         </w:rPr>
-        <w:t>Repositorio: https://github.com/webskechiza/Tecnicas-Programacion-OOP</w:t>
+        <w:t>Repositorio: https://github.com/webskechiza/Tecnicas-Programación-OOP</w:t>
       </w:r>
     </w:p>
     <w:p>
@@ -16212,7 +16167,7 @@
         <w:rPr>
           <w:color w:val="2C3E50"/>
         </w:rPr>
-        <w:t>El repositorio contiene el historial completo de commits realizados durante el ciclo 2026-I, incluyendo las versiones parciales (VetCare_Avance) y la version completa (Desarrollo/).</w:t>
+        <w:t>El repositorio contiene el historial completo de commits realizados durante el ciclo 2026-I, incluyendo las versiones parciales (VetCare_Avance) y la versión completa (Desarrollo/).</w:t>
       </w:r>
     </w:p>
     <w:p/>
@@ -16225,7 +16180,7 @@
           <w:b/>
           <w:color w:val="145A32"/>
         </w:rPr>
-        <w:t xml:space="preserve">  Anexo B - Estructura de Packages del Codigo Fuente</w:t>
+        <w:t xml:space="preserve">  Anexo B - Estructura de Packages del Código Fuente</w:t>
       </w:r>
     </w:p>
     <w:p>
@@ -16240,36 +16195,6 @@
           <w:sz w:val="18"/>
         </w:rPr>
         <w:t>package vetcare.gui;         -&gt; LoginFrame.java</w:t>
-        <w:br/>
-        <w:t xml:space="preserve">                                MainFrame.java</w:t>
-        <w:br/>
-        <w:t xml:space="preserve">                                PanelMascotas.java</w:t>
-        <w:br/>
-        <w:t xml:space="preserve">                                PanelDuenos.java</w:t>
-        <w:br/>
-        <w:t xml:space="preserve">                                PanelVeterinarios.java</w:t>
-        <w:br/>
-        <w:t xml:space="preserve">                                PanelCitas.java</w:t>
-        <w:br/>
-        <w:t xml:space="preserve">                                PanelHistorial.java</w:t>
-        <w:br/>
-        <w:t>package vetcare.modelo;      -&gt; Animal.java (abstracta)</w:t>
-        <w:br/>
-        <w:t xml:space="preserve">                                Perro.java / Gato.java / Ave.java</w:t>
-        <w:br/>
-        <w:t xml:space="preserve">                                Persona.java / Dueno.java / Veterinario.java</w:t>
-        <w:br/>
-        <w:t xml:space="preserve">                                Mascota.java / Cita.java / ConsultaMedica.java</w:t>
-        <w:br/>
-        <w:t>package vetcare.db;          -&gt; ConexionDB.java (Singleton JDBC)</w:t>
-        <w:br/>
-        <w:t xml:space="preserve">                                DuenoDB.java / VeterinarioDB.java</w:t>
-        <w:br/>
-        <w:t xml:space="preserve">                                MascotaDB.java / CitaDB.java / ConsultaDB.java</w:t>
-        <w:br/>
-        <w:t>package vetcare.interfaces;  -&gt; IGestionable&lt;T&gt;.java</w:t>
-        <w:br/>
-        <w:t>package vetcare.gui;         -&gt; MainGUI.java (main)</w:t>
       </w:r>
       <w:r>
         <w:rPr>
@@ -16277,6 +16202,8 @@
           <w:color w:val="FDF2D0"/>
           <w:sz w:val="18"/>
         </w:rPr>
+        <w:br/>
+        <w:t xml:space="preserve">                                MainFrame.java</w:t>
       </w:r>
       <w:r>
         <w:rPr>
@@ -16284,6 +16211,8 @@
           <w:color w:val="FDF2D0"/>
           <w:sz w:val="18"/>
         </w:rPr>
+        <w:br/>
+        <w:t xml:space="preserve">                                PanelMascotas.java</w:t>
       </w:r>
       <w:r>
         <w:rPr>
@@ -16291,6 +16220,8 @@
           <w:color w:val="FDF2D0"/>
           <w:sz w:val="18"/>
         </w:rPr>
+        <w:br/>
+        <w:t xml:space="preserve">                                PanelDuenos.java</w:t>
       </w:r>
       <w:r>
         <w:rPr>
@@ -16298,6 +16229,8 @@
           <w:color w:val="FDF2D0"/>
           <w:sz w:val="18"/>
         </w:rPr>
+        <w:br/>
+        <w:t xml:space="preserve">                                PanelVeterinarios.java</w:t>
       </w:r>
       <w:r>
         <w:rPr>
@@ -16305,6 +16238,8 @@
           <w:color w:val="FDF2D0"/>
           <w:sz w:val="18"/>
         </w:rPr>
+        <w:br/>
+        <w:t xml:space="preserve">                                PanelCitas.java</w:t>
       </w:r>
       <w:r>
         <w:rPr>
@@ -16312,6 +16247,8 @@
           <w:color w:val="FDF2D0"/>
           <w:sz w:val="18"/>
         </w:rPr>
+        <w:br/>
+        <w:t xml:space="preserve">                                PanelHistorial.java</w:t>
       </w:r>
       <w:r>
         <w:rPr>
@@ -16319,6 +16256,8 @@
           <w:color w:val="FDF2D0"/>
           <w:sz w:val="18"/>
         </w:rPr>
+        <w:br/>
+        <w:t>package vetcare.modelo;      -&gt; Animal.java (abstracta)</w:t>
       </w:r>
       <w:r>
         <w:rPr>
@@ -16326,6 +16265,8 @@
           <w:color w:val="FDF2D0"/>
           <w:sz w:val="18"/>
         </w:rPr>
+        <w:br/>
+        <w:t xml:space="preserve">                                Perro.java / Gato.java / Ave.java</w:t>
       </w:r>
       <w:r>
         <w:rPr>
@@ -16333,6 +16274,8 @@
           <w:color w:val="FDF2D0"/>
           <w:sz w:val="18"/>
         </w:rPr>
+        <w:br/>
+        <w:t xml:space="preserve">                                Persona.java / Dueno.java / Veterinario.java</w:t>
       </w:r>
       <w:r>
         <w:rPr>
@@ -16340,6 +16283,8 @@
           <w:color w:val="FDF2D0"/>
           <w:sz w:val="18"/>
         </w:rPr>
+        <w:br/>
+        <w:t xml:space="preserve">                                Mascota.java / Cita.java / ConsultaMedica.java</w:t>
       </w:r>
       <w:r>
         <w:rPr>
@@ -16347,6 +16292,8 @@
           <w:color w:val="FDF2D0"/>
           <w:sz w:val="18"/>
         </w:rPr>
+        <w:br/>
+        <w:t>package vetcare.db;          -&gt; ConexionDB.java (Singleton JDBC)</w:t>
       </w:r>
       <w:r>
         <w:rPr>
@@ -16354,6 +16301,8 @@
           <w:color w:val="FDF2D0"/>
           <w:sz w:val="18"/>
         </w:rPr>
+        <w:br/>
+        <w:t xml:space="preserve">                                DuenoDB.java / VeterinarioDB.java</w:t>
       </w:r>
       <w:r>
         <w:rPr>
@@ -16361,6 +16310,8 @@
           <w:color w:val="FDF2D0"/>
           <w:sz w:val="18"/>
         </w:rPr>
+        <w:br/>
+        <w:t xml:space="preserve">                                MascotaDB.java / CitaDB.java / ConsultaDB.java</w:t>
       </w:r>
       <w:r>
         <w:rPr>
@@ -16368,6 +16319,8 @@
           <w:color w:val="FDF2D0"/>
           <w:sz w:val="18"/>
         </w:rPr>
+        <w:br/>
+        <w:t>package vetcare.interfaces;  -&gt; IGestionable&lt;T&gt;.java</w:t>
       </w:r>
       <w:r>
         <w:rPr>
@@ -16375,6 +16328,8 @@
           <w:color w:val="FDF2D0"/>
           <w:sz w:val="18"/>
         </w:rPr>
+        <w:br/>
+        <w:t>package vetcare.gui;         -&gt; MainGUI.java (main)</w:t>
       </w:r>
     </w:p>
     <w:p/>
@@ -16387,7 +16342,7 @@
           <w:b/>
           <w:color w:val="145A32"/>
         </w:rPr>
-        <w:t xml:space="preserve">  Anexo C - Fragmento de Codigo: Main.java</w:t>
+        <w:t xml:space="preserve">  Anexo C - Fragmento de Código: Main.java</w:t>
       </w:r>
     </w:p>
     <w:p>
@@ -16403,12 +16358,32 @@
         </w:rPr>
         <w:t>▸  vetcare.gui.LoginFrame             - Autenticación (JDialog)</w:t>
       </w:r>
+    </w:p>
+    <w:p/>
+    <w:p>
+      <w:pPr>
+        <w:shd w:val="clear" w:color="auto" w:fill="E8F8F0"/>
+      </w:pPr>
+      <w:r>
+        <w:rPr>
+          <w:b/>
+          <w:color w:val="145A32"/>
+        </w:rPr>
+        <w:t xml:space="preserve">  Anexo D - Fragmento de Código: IGestionable.java</w:t>
+      </w:r>
+    </w:p>
+    <w:p>
+      <w:pPr>
+        <w:shd w:val="clear" w:color="auto" w:fill="2C3E50"/>
+        <w:ind w:left="283"/>
+      </w:pPr>
       <w:r>
         <w:rPr>
           <w:rFonts w:ascii="Courier New" w:hAnsi="Courier New"/>
           <w:color w:val="FDF2D0"/>
           <w:sz w:val="18"/>
         </w:rPr>
+        <w:t>package vetcare.gestion;</w:t>
       </w:r>
       <w:r>
         <w:rPr>
@@ -16416,6 +16391,7 @@
           <w:color w:val="FDF2D0"/>
           <w:sz w:val="18"/>
         </w:rPr>
+        <w:br/>
       </w:r>
       <w:r>
         <w:rPr>
@@ -16423,6 +16399,8 @@
           <w:color w:val="FDF2D0"/>
           <w:sz w:val="18"/>
         </w:rPr>
+        <w:br/>
+        <w:t>import java.util.List;</w:t>
       </w:r>
       <w:r>
         <w:rPr>
@@ -16430,6 +16408,7 @@
           <w:color w:val="FDF2D0"/>
           <w:sz w:val="18"/>
         </w:rPr>
+        <w:br/>
       </w:r>
       <w:r>
         <w:rPr>
@@ -16437,6 +16416,8 @@
           <w:color w:val="FDF2D0"/>
           <w:sz w:val="18"/>
         </w:rPr>
+        <w:br/>
+        <w:t>public interface IGestionable&lt;T&gt; {</w:t>
       </w:r>
       <w:r>
         <w:rPr>
@@ -16444,6 +16425,8 @@
           <w:color w:val="FDF2D0"/>
           <w:sz w:val="18"/>
         </w:rPr>
+        <w:br/>
+        <w:t xml:space="preserve">    void agregar(T elemento);</w:t>
       </w:r>
       <w:r>
         <w:rPr>
@@ -16451,6 +16434,8 @@
           <w:color w:val="FDF2D0"/>
           <w:sz w:val="18"/>
         </w:rPr>
+        <w:br/>
+        <w:t xml:space="preserve">    T buscarPorId(int id);</w:t>
       </w:r>
       <w:r>
         <w:rPr>
@@ -16458,6 +16443,8 @@
           <w:color w:val="FDF2D0"/>
           <w:sz w:val="18"/>
         </w:rPr>
+        <w:br/>
+        <w:t xml:space="preserve">    List&lt;T&gt; getTodas();</w:t>
       </w:r>
       <w:r>
         <w:rPr>
@@ -16465,34 +16452,16 @@
           <w:color w:val="FDF2D0"/>
           <w:sz w:val="18"/>
         </w:rPr>
-      </w:r>
-    </w:p>
-    <w:p/>
-    <w:p>
-      <w:pPr>
-        <w:shd w:val="clear" w:color="auto" w:fill="E8F8F0"/>
-      </w:pPr>
-      <w:r>
-        <w:rPr>
-          <w:b/>
-          <w:color w:val="145A32"/>
-        </w:rPr>
-        <w:t xml:space="preserve">  Anexo D - Fragmento de Codigo: IGestionable.java</w:t>
-      </w:r>
-    </w:p>
-    <w:p>
-      <w:pPr>
-        <w:shd w:val="clear" w:color="auto" w:fill="2C3E50"/>
-        <w:ind w:left="283"/>
-      </w:pPr>
+        <w:br/>
+        <w:t xml:space="preserve">    boolean eliminar(int id);</w:t>
+      </w:r>
       <w:r>
         <w:rPr>
           <w:rFonts w:ascii="Courier New" w:hAnsi="Courier New"/>
           <w:color w:val="FDF2D0"/>
           <w:sz w:val="18"/>
         </w:rPr>
-        <w:lastRenderedPageBreak/>
-        <w:t>package vetcare.gestion;</w:t>
+        <w:br/>
       </w:r>
       <w:r>
         <w:rPr>
@@ -16500,7 +16469,8 @@
           <w:color w:val="FDF2D0"/>
           <w:sz w:val="18"/>
         </w:rPr>
-        <w:br/>
+        <w:lastRenderedPageBreak/>
+        <w:t xml:space="preserve">    void listar();</w:t>
       </w:r>
       <w:r>
         <w:rPr>
@@ -16509,99 +16479,29 @@
           <w:sz w:val="18"/>
         </w:rPr>
         <w:br/>
-        <w:t>import java.util.List;</w:t>
-      </w:r>
-      <w:r>
-        <w:rPr>
-          <w:rFonts w:ascii="Courier New" w:hAnsi="Courier New"/>
+        <w:t>}</w:t>
+      </w:r>
+    </w:p>
+    <w:p>
+      <w:r>
+        <w:br w:type="page"/>
+      </w:r>
+    </w:p>
+    <w:p>
+      <w:pPr>
+        <w:shd w:val="clear" w:color="auto" w:fill="145A32"/>
+        <w:jc w:val="center"/>
+      </w:pPr>
+      <w:r>
+        <w:rPr>
           <w:color w:val="FDF2D0"/>
           <w:sz w:val="18"/>
         </w:rPr>
-        <w:br/>
-      </w:r>
-      <w:r>
-        <w:rPr>
-          <w:rFonts w:ascii="Courier New" w:hAnsi="Courier New"/>
-          <w:color w:val="FDF2D0"/>
-          <w:sz w:val="18"/>
-        </w:rPr>
-        <w:br/>
-        <w:t>public interface IGestionable&lt;T&gt; {</w:t>
-      </w:r>
-      <w:r>
-        <w:rPr>
-          <w:rFonts w:ascii="Courier New" w:hAnsi="Courier New"/>
-          <w:color w:val="FDF2D0"/>
-          <w:sz w:val="18"/>
-        </w:rPr>
-        <w:br/>
-        <w:t xml:space="preserve">    void agregar(T elemento);</w:t>
-      </w:r>
-      <w:r>
-        <w:rPr>
-          <w:rFonts w:ascii="Courier New" w:hAnsi="Courier New"/>
-          <w:color w:val="FDF2D0"/>
-          <w:sz w:val="18"/>
-        </w:rPr>
-        <w:br/>
-        <w:t xml:space="preserve">    T buscarPorId(int id);</w:t>
-      </w:r>
-      <w:r>
-        <w:rPr>
-          <w:rFonts w:ascii="Courier New" w:hAnsi="Courier New"/>
-          <w:color w:val="FDF2D0"/>
-          <w:sz w:val="18"/>
-        </w:rPr>
-        <w:br/>
-        <w:t xml:space="preserve">    List&lt;T&gt; getTodas();</w:t>
-      </w:r>
-      <w:r>
-        <w:rPr>
-          <w:rFonts w:ascii="Courier New" w:hAnsi="Courier New"/>
-          <w:color w:val="FDF2D0"/>
-          <w:sz w:val="18"/>
-        </w:rPr>
-        <w:br/>
-        <w:t xml:space="preserve">    boolean eliminar(int id);</w:t>
-      </w:r>
-      <w:r>
-        <w:rPr>
-          <w:rFonts w:ascii="Courier New" w:hAnsi="Courier New"/>
-          <w:color w:val="FDF2D0"/>
-          <w:sz w:val="18"/>
-        </w:rPr>
-        <w:br/>
-        <w:t xml:space="preserve">    void listar();</w:t>
-      </w:r>
-      <w:r>
-        <w:rPr>
-          <w:rFonts w:ascii="Courier New" w:hAnsi="Courier New"/>
-          <w:color w:val="FDF2D0"/>
-          <w:sz w:val="18"/>
-        </w:rPr>
-        <w:br/>
-        <w:t>}</w:t>
+        <w:lastRenderedPageBreak/>
+        <w:t xml:space="preserve">  VetCare - Sistema de Gestión de Clínica Veterinaria  |  UPN 2026-I  |  Técnicas de Programación Orientada a Objetos  </w:t>
       </w:r>
     </w:p>
-    <w:p>
-      <w:r>
-        <w:br w:type="page"/>
-      </w:r>
-    </w:p>
-    <w:p>
-      <w:pPr>
-        <w:shd w:val="clear" w:color="auto" w:fill="145A32"/>
-        <w:jc w:val="center"/>
-      </w:pPr>
-      <w:r>
-        <w:rPr>
-          <w:color w:val="FDF2D0"/>
-          <w:sz w:val="18"/>
-        </w:rPr>
-        <w:lastRenderedPageBreak/>
-        <w:t xml:space="preserve">  VetCare - Sistema de Gestion de Clinica Veterinaria  |  UPN 2026-I  |  Tecnicas de Programacion Orientada a Objetos  </w:t>
-      </w:r>
-    </w:p>
+    <w:p/>
     <w:sectPr>
       <w:pgSz w:w="12240" w:h="15840"/>
       <w:pgMar w:top="1417" w:right="1417" w:bottom="1417" w:left="1417" w:header="720" w:footer="720" w:gutter="0"/>
@@ -17207,6 +17107,7 @@
     <w:rsid w:val="00FC693F"/>
     <w:rPr>
       <w:rFonts w:ascii="Calibri" w:hAnsi="Calibri"/>
+      <w:lang w:val="es-PE"/>
     </w:rPr>
   </w:style>
   <w:style w:type="paragraph" w:styleId="Ttulo1">

</xml_diff>